<commit_message>
Build pension social security portal
</commit_message>
<xml_diff>
--- a/assets/downloads/woek_rente_soziale_sicherung_detailkonzepte_umfangreich_v0_1.docx
+++ b/assets/downloads/woek_rente_soziale_sicherung_detailkonzepte_umfangreich_v0_1.docx
@@ -1,6 +1,6 @@
 
 <file path=word/document.xml><?xml version="1.0" encoding="utf-8"?>
-<w:document xmlns:wpc="http://schemas.microsoft.com/office/word/2010/wordprocessingCanvas" xmlns:mo="http://schemas.microsoft.com/office/mac/office/2008/main" xmlns:mc="http://schemas.openxmlformats.org/markup-compatibility/2006" xmlns:mv="urn:schemas-microsoft-com:mac:vml" xmlns:o="urn:schemas-microsoft-com:office:office" xmlns:r="http://schemas.openxmlformats.org/officeDocument/2006/relationships" xmlns:m="http://schemas.openxmlformats.org/officeDocument/2006/math" xmlns:v="urn:schemas-microsoft-com:vml" xmlns:wp14="http://schemas.microsoft.com/office/word/2010/wordprocessingDrawing" xmlns:wp="http://schemas.openxmlformats.org/drawingml/2006/wordprocessingDrawing" xmlns:w10="urn:schemas-microsoft-com:office:word" xmlns:w="http://schemas.openxmlformats.org/wordprocessingml/2006/main" xmlns:w14="http://schemas.microsoft.com/office/word/2010/wordml" xmlns:wpg="http://schemas.microsoft.com/office/word/2010/wordprocessingGroup" xmlns:wpi="http://schemas.microsoft.com/office/word/2010/wordprocessingInk" xmlns:wne="http://schemas.microsoft.com/office/word/2006/wordml" xmlns:wps="http://schemas.microsoft.com/office/word/2010/wordprocessingShape" mc:Ignorable="w14 wp14">
+<w:document xmlns:ns1="http://schemas.openxmlformats.org/markup-compatibility/2006" xmlns:ns2="http://schemas.openxmlformats.org/officeDocument/2006/relationships" xmlns:w="http://schemas.openxmlformats.org/wordprocessingml/2006/main" ns1:Ignorable="w14 wp14">
   <w:body>
     <w:p>
       <w:pPr>
@@ -323,11 +323,6 @@
       </w:r>
     </w:p>
     <w:p>
-      <w:r>
-        <w:t>Dieses Dokument ist als öffentliche Arbeits- und Diskussionsfassung angelegt. Es enthält ausschließlich fachliche Publikationsinhalte. Die Kapitel sind so strukturiert, dass sie als Online-Volltext mit Ankern, Dossier-Download, Druckfunktion, SDG-/SDG+-Bezug und Buchankern veröffentlicht werden können.</w:t>
-      </w:r>
-    </w:p>
-    <w:p>
       <w:pPr>
         <w:pStyle w:val="Heading1"/>
       </w:pPr>
@@ -566,16 +561,246 @@
       </w:r>
     </w:p>
     <w:p>
+      <w:r>
+        <w:br w:type="page"/>
+      </w:r>
+    </w:p>
+    <w:p>
+      <w:pPr>
+        <w:pStyle w:val="Heading1"/>
+      </w:pPr>
+      <w:r>
+        <w:t>2. Basisrente, Würdesicherung und soziale Teilhabe</w:t>
+      </w:r>
+    </w:p>
+    <w:p>
       <w:pPr>
         <w:pStyle w:val="Heading2"/>
       </w:pPr>
       <w:r>
-        <w:t>10. Online-Umsetzung</w:t>
-      </w:r>
-    </w:p>
-    <w:p>
-      <w:r>
-        <w:t>Dieses Detailkonzept sollte online unter /wirkungsfelder/rente-soziale-sicherung/wirkungsrente-generationenvertrag/ veröffentlicht werden. Die Seite benötigt Inhaltsverzeichnis, Kapitelanker, Dossier-Download, Kontext-Werkzeuge, Buchanker, SDG-/SDG+-Referenzblock und Druckfunktion.</w:t>
+        <w:t>1. Zweck und Abgrenzung</w:t>
+      </w:r>
+    </w:p>
+    <w:p>
+      <w:r>
+        <w:t>Dieses Detailkonzept beschreibt den Unterbereich "Basisrente, Würdesicherung und soziale Teilhabe" als eigenständigen Baustein des Portals Rente &amp; soziale Sicherung. Es grenzt den Baustein von klassischen Rentenreformen ab und zeigt, wie er in die Wirkungsökonomie eingebettet wird.</w:t>
+      </w:r>
+    </w:p>
+    <w:p>
+      <w:pPr>
+        <w:pStyle w:val="Heading2"/>
+      </w:pPr>
+      <w:r>
+        <w:t>2. Alte Logik und Problemstruktur</w:t>
+      </w:r>
+    </w:p>
+    <w:p>
+      <w:r>
+        <w:t>Altersarmut und Unsicherheit entstehen dort, wo Alterssicherung zu stark an Markteinkommen gekoppelt bleibt. Wer lange Care leistet, prekär arbeitet oder von Strukturwandel betroffen ist, kann trotz hoher Lebenswirkung geringe Rentenansprüche haben.</w:t>
+      </w:r>
+    </w:p>
+    <w:p>
+      <w:r>
+        <w:t>Die alte Logik behandelt Rente als nachgelagerte Auszahlung aus Erwerbs- und Beitragsbiografien. Das ist verwaltungstechnisch klar, aber wirkungsökonomisch unvollständig. Denn sie übersieht, ob eine Tätigkeit Folgekosten senkt, Vertrauen stärkt, Generationen verbindet, Pflege leistet oder Transformation ermöglicht. Ein wirkungsökonomisches Detailkonzept muss deshalb zwischen Einkommen, Beschäftigung, Leistung und Wirkung unterscheiden.</w:t>
+      </w:r>
+    </w:p>
+    <w:p>
+      <w:pPr>
+        <w:pStyle w:val="Heading2"/>
+      </w:pPr>
+      <w:r>
+        <w:t>3. Wirkungsökonomischer Perspektivwechsel</w:t>
+      </w:r>
+    </w:p>
+    <w:p>
+      <w:r>
+        <w:t>Eine wirkungsökonomische Basisrente schützt Würde und Teilhabe unabhängig davon, ob Lebensleistung in hohe Einkommen übersetzt wurde. Sie ist kein Almosen, sondern die untere Stabilitätsebene eines demokratischen Gemeinwesens.</w:t>
+      </w:r>
+    </w:p>
+    <w:p>
+      <w:r>
+        <w:t>Wirkungsökonomisch wird nicht gefragt, ob eine Person "mehr wert" ist. Gefragt wird, welche Zustände durch Lebensleistung, Institutionen und Systeme verbessert oder verschlechtert werden und wie ein soziales Sicherungssystem diese Wirklichkeit fairer abbilden kann. Dabei bleibt der Schutz vor Personenbewertung zentral.</w:t>
+      </w:r>
+    </w:p>
+    <w:p>
+      <w:pPr>
+        <w:pStyle w:val="Heading2"/>
+      </w:pPr>
+      <w:r>
+        <w:t>4. Unterkapitel und Struktur</w:t>
+      </w:r>
+    </w:p>
+    <w:p>
+      <w:pPr>
+        <w:pStyle w:val="Heading3"/>
+      </w:pPr>
+      <w:r>
+        <w:t>Würdegrenze statt bloßer Mindestsicherung</w:t>
+      </w:r>
+    </w:p>
+    <w:p>
+      <w:r>
+        <w:t>Dieser Abschnitt untersucht würdegrenze statt bloßer mindestsicherung im Zusammenhang mit Rente, sozialer Sicherung und positiver Netto-Wirkung. Er beschreibt, welche Informationen benötigt werden, welche Akteure betroffen sind, welche rechtlichen Grenzen bestehen und welche Gestaltungsspielräume politisch offen bleiben.</w:t>
+      </w:r>
+    </w:p>
+    <w:p>
+      <w:pPr>
+        <w:pStyle w:val="Heading3"/>
+      </w:pPr>
+      <w:r>
+        <w:t>Teilhabe im Alter als gesellschaftliche Infrastruktur</w:t>
+      </w:r>
+    </w:p>
+    <w:p>
+      <w:r>
+        <w:t>Dieser Abschnitt untersucht teilhabe im alter als gesellschaftliche infrastruktur im Zusammenhang mit Rente, sozialer Sicherung und positiver Netto-Wirkung. Er beschreibt, welche Informationen benötigt werden, welche Akteure betroffen sind, welche rechtlichen Grenzen bestehen und welche Gestaltungsspielräume politisch offen bleiben.</w:t>
+      </w:r>
+    </w:p>
+    <w:p>
+      <w:pPr>
+        <w:pStyle w:val="Heading3"/>
+      </w:pPr>
+      <w:r>
+        <w:t>Verbindung zu Grundsicherung und Pflege</w:t>
+      </w:r>
+    </w:p>
+    <w:p>
+      <w:r>
+        <w:t>Dieser Abschnitt untersucht verbindung zu grundsicherung und pflege im Zusammenhang mit Rente, sozialer Sicherung und positiver Netto-Wirkung. Er beschreibt, welche Informationen benötigt werden, welche Akteure betroffen sind, welche rechtlichen Grenzen bestehen und welche Gestaltungsspielräume politisch offen bleiben.</w:t>
+      </w:r>
+    </w:p>
+    <w:p>
+      <w:pPr>
+        <w:pStyle w:val="Heading3"/>
+      </w:pPr>
+      <w:r>
+        <w:t>Schutz vor verdeckter Altersarmut</w:t>
+      </w:r>
+    </w:p>
+    <w:p>
+      <w:r>
+        <w:t>Dieser Abschnitt untersucht schutz vor verdeckter altersarmut im Zusammenhang mit Rente, sozialer Sicherung und positiver Netto-Wirkung. Er beschreibt, welche Informationen benötigt werden, welche Akteure betroffen sind, welche rechtlichen Grenzen bestehen und welche Gestaltungsspielräume politisch offen bleiben.</w:t>
+      </w:r>
+    </w:p>
+    <w:p>
+      <w:pPr>
+        <w:pStyle w:val="Heading3"/>
+      </w:pPr>
+      <w:r>
+        <w:t>Finanzierung und politische Spielräume</w:t>
+      </w:r>
+    </w:p>
+    <w:p>
+      <w:r>
+        <w:t>Dieser Abschnitt untersucht finanzierung und politische spielräume im Zusammenhang mit Rente, sozialer Sicherung und positiver Netto-Wirkung. Er beschreibt, welche Informationen benötigt werden, welche Akteure betroffen sind, welche rechtlichen Grenzen bestehen und welche Gestaltungsspielräume politisch offen bleiben.</w:t>
+      </w:r>
+    </w:p>
+    <w:p>
+      <w:pPr>
+        <w:pStyle w:val="Heading2"/>
+      </w:pPr>
+      <w:r>
+        <w:t>5. Daten, Indikatoren und WÖk-ID-Anschluss</w:t>
+      </w:r>
+    </w:p>
+    <w:p>
+      <w:r>
+        <w:t>Der Unterbereich benötigt eine Datenlogik, die aus bestehenden Quellen schöpft, aber nicht in Überwachung kippt. Mögliche Indikatorfamilien sind faire Arbeit und Einkommen, Sozialschutz, Care und Vereinbarkeit, Weiterbildung, Gesundheit, gesellschaftlicher Zusammenhalt, institutionelles Vertrauen, digitale Selbstbestimmung und Kapitalwirkung. WÖk-IDs dienen als Adresse der Wirkung, nicht als Personenetikett.</w:t>
+      </w:r>
+    </w:p>
+    <w:p>
+      <w:pPr>
+        <w:pStyle w:val="Heading2"/>
+      </w:pPr>
+      <w:r>
+        <w:t>6. Berechnungs- oder Bewertungslogik</w:t>
+      </w:r>
+    </w:p>
+    <w:p>
+      <w:r>
+        <w:t>Die Bewertungslogik ist modular: Zuerst wird die Würdeebene geschützt, danach werden klassische Ansprüche gesichert, erst dann werden Wirkungsboni oder Fondsanteile ergänzt. Bei unsicheren Daten gilt ein Vorsichtsprinzip. In der Pilotphase werden positive Wirkungen sichtbar gemacht, negative Systemwirkungen primär über Unternehmens-, Produkt-, Kapital- und Steuerinstrumente rückgekoppelt.</w:t>
+      </w:r>
+    </w:p>
+    <w:p>
+      <w:pPr>
+        <w:pStyle w:val="Heading2"/>
+      </w:pPr>
+      <w:r>
+        <w:t>7. Schutzlinien</w:t>
+      </w:r>
+    </w:p>
+    <w:p>
+      <w:pPr>
+        <w:pStyle w:val="ListBullet"/>
+      </w:pPr>
+      <w:r>
+        <w:t>Keine automatische Letztentscheidung.</w:t>
+      </w:r>
+    </w:p>
+    <w:p>
+      <w:pPr>
+        <w:pStyle w:val="ListBullet"/>
+      </w:pPr>
+      <w:r>
+        <w:t>Keine Absenkung unter die Würde- und Teilhabeebene.</w:t>
+      </w:r>
+    </w:p>
+    <w:p>
+      <w:pPr>
+        <w:pStyle w:val="ListBullet"/>
+      </w:pPr>
+      <w:r>
+        <w:t>Keine pauschale Bewertung von Personen nach Branchenzugehörigkeit.</w:t>
+      </w:r>
+    </w:p>
+    <w:p>
+      <w:pPr>
+        <w:pStyle w:val="ListBullet"/>
+      </w:pPr>
+      <w:r>
+        <w:t>Datensparsamkeit und Zweckbindung.</w:t>
+      </w:r>
+    </w:p>
+    <w:p>
+      <w:pPr>
+        <w:pStyle w:val="ListBullet"/>
+      </w:pPr>
+      <w:r>
+        <w:t>Recht auf Auskunft, Korrektur und Widerspruch.</w:t>
+      </w:r>
+    </w:p>
+    <w:p>
+      <w:pPr>
+        <w:pStyle w:val="ListBullet"/>
+      </w:pPr>
+      <w:r>
+        <w:t>Parlamentarische und gerichtliche Kontrolle.</w:t>
+      </w:r>
+    </w:p>
+    <w:p>
+      <w:pPr>
+        <w:pStyle w:val="Heading2"/>
+      </w:pPr>
+      <w:r>
+        <w:t>8. Politische Anschlussfähigkeit</w:t>
+      </w:r>
+    </w:p>
+    <w:p>
+      <w:r>
+        <w:t>Der Baustein ist politisch offen. Er kann konservativ als Anerkennung von Lebensleistung, sozialdemokratisch als soziale Sicherheit, liberal als Eigenverantwortung mit transparenten Anreizen, grün als Zukunftsinvestition, links als Schutz vor Altersarmut, kommunal als Teilhabeinstrument oder wirtschaftsnah als Resilienzfaktor interpretiert werden. Die Wirkungsökonomie gibt den Rahmen, nicht die parteipolitische Detailentscheidung vor.</w:t>
+      </w:r>
+    </w:p>
+    <w:p>
+      <w:pPr>
+        <w:pStyle w:val="Heading2"/>
+      </w:pPr>
+      <w:r>
+        <w:t>9. SDG-/SDG+-Bezug</w:t>
+      </w:r>
+    </w:p>
+    <w:p>
+      <w:r>
+        <w:t>SDG 1, SDG 3, SDG 10, SDG 16, SDG+ gesellschaftlicher Zusammenhalt</w:t>
       </w:r>
     </w:p>
     <w:p>
@@ -588,7 +813,7 @@
         <w:pStyle w:val="Heading1"/>
       </w:pPr>
       <w:r>
-        <w:t>2. Basisrente, Würdesicherung und soziale Teilhabe</w:t>
+        <w:t>3. Lebenswirkungs-Konto und Wirkungsbiografie</w:t>
       </w:r>
     </w:p>
     <w:p>
@@ -601,7 +826,7 @@
     </w:p>
     <w:p>
       <w:r>
-        <w:t>Dieses Detailkonzept beschreibt den Unterbereich "Basisrente, Würdesicherung und soziale Teilhabe" als eigenständigen Baustein des Portals Rente &amp; soziale Sicherung. Es grenzt den Baustein von klassischen Rentenreformen ab und zeigt, wie er in die Wirkungsökonomie eingebettet wird.</w:t>
+        <w:t>Dieses Detailkonzept beschreibt den Unterbereich "Lebenswirkungs-Konto und Wirkungsbiografie" als eigenständigen Baustein des Portals Rente &amp; soziale Sicherung. Es grenzt den Baustein von klassischen Rentenreformen ab und zeigt, wie er in die Wirkungsökonomie eingebettet wird.</w:t>
       </w:r>
     </w:p>
     <w:p>
@@ -614,7 +839,7 @@
     </w:p>
     <w:p>
       <w:r>
-        <w:t>Altersarmut und Unsicherheit entstehen dort, wo Alterssicherung zu stark an Markteinkommen gekoppelt bleibt. Wer lange Care leistet, prekär arbeitet oder von Strukturwandel betroffen ist, kann trotz hoher Lebenswirkung geringe Rentenansprüche haben.</w:t>
+        <w:t>Lebensläufe werden rentenrechtlich häufig als Beitrags-, Versicherungs- und Lückenbiografien gelesen. Diese Sicht erkennt Tätigkeiten nur unvollständig, die nicht gut bezahlt sind, aber Zustände verbessern.</w:t>
       </w:r>
     </w:p>
     <w:p>
@@ -632,7 +857,7 @@
     </w:p>
     <w:p>
       <w:r>
-        <w:t>Eine wirkungsökonomische Basisrente schützt Würde und Teilhabe unabhängig davon, ob Lebensleistung in hohe Einkommen übersetzt wurde. Sie ist kein Almosen, sondern die untere Stabilitätsebene eines demokratischen Gemeinwesens.</w:t>
+        <w:t>Das Lebenswirkungs-Konto macht Wirkung über den Lebenslauf sichtbar, ohne Menschen zu bewerten. Es dokumentiert anerkannte Wirkungsräume, Qualifikationen, Care-Zeiten, Engagement, Transformationsbeiträge und Belastungen als Grundlage für Transparenz und Fairness.</w:t>
       </w:r>
     </w:p>
     <w:p>
@@ -653,12 +878,12 @@
         <w:pStyle w:val="Heading3"/>
       </w:pPr>
       <w:r>
-        <w:t>Würdegrenze statt bloßer Mindestsicherung</w:t>
-      </w:r>
-    </w:p>
-    <w:p>
-      <w:r>
-        <w:t>Dieser Abschnitt untersucht würdegrenze statt bloßer mindestsicherung im Zusammenhang mit Rente, sozialer Sicherung und positiver Netto-Wirkung. Er beschreibt, welche Informationen benötigt werden, welche Akteure betroffen sind, welche rechtlichen Grenzen bestehen und welche Gestaltungsspielräume politisch offen bleiben.</w:t>
+        <w:t>Was gespeichert wird - und was nicht</w:t>
+      </w:r>
+    </w:p>
+    <w:p>
+      <w:r>
+        <w:t>Dieser Abschnitt untersucht was gespeichert wird - und was nicht im Zusammenhang mit Rente, sozialer Sicherung und positiver Netto-Wirkung. Er beschreibt, welche Informationen benötigt werden, welche Akteure betroffen sind, welche rechtlichen Grenzen bestehen und welche Gestaltungsspielräume politisch offen bleiben.</w:t>
       </w:r>
     </w:p>
     <w:p>
@@ -666,12 +891,12 @@
         <w:pStyle w:val="Heading3"/>
       </w:pPr>
       <w:r>
-        <w:t>Teilhabe im Alter als gesellschaftliche Infrastruktur</w:t>
-      </w:r>
-    </w:p>
-    <w:p>
-      <w:r>
-        <w:t>Dieser Abschnitt untersucht teilhabe im alter als gesellschaftliche infrastruktur im Zusammenhang mit Rente, sozialer Sicherung und positiver Netto-Wirkung. Er beschreibt, welche Informationen benötigt werden, welche Akteure betroffen sind, welche rechtlichen Grenzen bestehen und welche Gestaltungsspielräume politisch offen bleiben.</w:t>
+        <w:t>Keine Personenbewertung, kein Social Credit</w:t>
+      </w:r>
+    </w:p>
+    <w:p>
+      <w:r>
+        <w:t>Dieser Abschnitt untersucht keine personenbewertung, kein social credit im Zusammenhang mit Rente, sozialer Sicherung und positiver Netto-Wirkung. Er beschreibt, welche Informationen benötigt werden, welche Akteure betroffen sind, welche rechtlichen Grenzen bestehen und welche Gestaltungsspielräume politisch offen bleiben.</w:t>
       </w:r>
     </w:p>
     <w:p>
@@ -679,12 +904,12 @@
         <w:pStyle w:val="Heading3"/>
       </w:pPr>
       <w:r>
-        <w:t>Verbindung zu Grundsicherung und Pflege</w:t>
-      </w:r>
-    </w:p>
-    <w:p>
-      <w:r>
-        <w:t>Dieser Abschnitt untersucht verbindung zu grundsicherung und pflege im Zusammenhang mit Rente, sozialer Sicherung und positiver Netto-Wirkung. Er beschreibt, welche Informationen benötigt werden, welche Akteure betroffen sind, welche rechtlichen Grenzen bestehen und welche Gestaltungsspielräume politisch offen bleiben.</w:t>
+        <w:t>Anerkennungsfelder und Nachweise</w:t>
+      </w:r>
+    </w:p>
+    <w:p>
+      <w:r>
+        <w:t>Dieser Abschnitt untersucht anerkennungsfelder und nachweise im Zusammenhang mit Rente, sozialer Sicherung und positiver Netto-Wirkung. Er beschreibt, welche Informationen benötigt werden, welche Akteure betroffen sind, welche rechtlichen Grenzen bestehen und welche Gestaltungsspielräume politisch offen bleiben.</w:t>
       </w:r>
     </w:p>
     <w:p>
@@ -692,12 +917,12 @@
         <w:pStyle w:val="Heading3"/>
       </w:pPr>
       <w:r>
-        <w:t>Schutz vor verdeckter Altersarmut</w:t>
-      </w:r>
-    </w:p>
-    <w:p>
-      <w:r>
-        <w:t>Dieser Abschnitt untersucht schutz vor verdeckter altersarmut im Zusammenhang mit Rente, sozialer Sicherung und positiver Netto-Wirkung. Er beschreibt, welche Informationen benötigt werden, welche Akteure betroffen sind, welche rechtlichen Grenzen bestehen und welche Gestaltungsspielräume politisch offen bleiben.</w:t>
+        <w:t>Datenschutz und Recht auf Korrektur</w:t>
+      </w:r>
+    </w:p>
+    <w:p>
+      <w:r>
+        <w:t>Dieser Abschnitt untersucht datenschutz und recht auf korrektur im Zusammenhang mit Rente, sozialer Sicherung und positiver Netto-Wirkung. Er beschreibt, welche Informationen benötigt werden, welche Akteure betroffen sind, welche rechtlichen Grenzen bestehen und welche Gestaltungsspielräume politisch offen bleiben.</w:t>
       </w:r>
     </w:p>
     <w:p>
@@ -705,12 +930,12 @@
         <w:pStyle w:val="Heading3"/>
       </w:pPr>
       <w:r>
-        <w:t>Finanzierung und politische Spielräume</w:t>
-      </w:r>
-    </w:p>
-    <w:p>
-      <w:r>
-        <w:t>Dieser Abschnitt untersucht finanzierung und politische spielräume im Zusammenhang mit Rente, sozialer Sicherung und positiver Netto-Wirkung. Er beschreibt, welche Informationen benötigt werden, welche Akteure betroffen sind, welche rechtlichen Grenzen bestehen und welche Gestaltungsspielräume politisch offen bleiben.</w:t>
+        <w:t>Online- und Offline-Zugänglichkeit</w:t>
+      </w:r>
+    </w:p>
+    <w:p>
+      <w:r>
+        <w:t>Dieser Abschnitt untersucht online- und offline-zugänglichkeit im Zusammenhang mit Rente, sozialer Sicherung und positiver Netto-Wirkung. Er beschreibt, welche Informationen benötigt werden, welche Akteure betroffen sind, welche rechtlichen Grenzen bestehen und welche Gestaltungsspielräume politisch offen bleiben.</w:t>
       </w:r>
     </w:p>
     <w:p>
@@ -818,7 +1043,20 @@
     </w:p>
     <w:p>
       <w:r>
-        <w:t>SDG 1, SDG 3, SDG 10, SDG 16, SDG+ gesellschaftlicher Zusammenhalt</w:t>
+        <w:t>SDG 4, SDG 5, SDG 8, SDG 10, SDG 16, SDG+ digitale Selbstbestimmung</w:t>
+      </w:r>
+    </w:p>
+    <w:p>
+      <w:r>
+        <w:br w:type="page"/>
+      </w:r>
+    </w:p>
+    <w:p>
+      <w:pPr>
+        <w:pStyle w:val="Heading1"/>
+      </w:pPr>
+      <w:r>
+        <w:t>4. Lebenswirkungs-Faktor und Berechnungslogik</w:t>
       </w:r>
     </w:p>
     <w:p>
@@ -826,12 +1064,229 @@
         <w:pStyle w:val="Heading2"/>
       </w:pPr>
       <w:r>
-        <w:t>10. Online-Umsetzung</w:t>
-      </w:r>
-    </w:p>
-    <w:p>
-      <w:r>
-        <w:t>Dieses Detailkonzept sollte online unter /wirkungsfelder/rente-soziale-sicherung/basisrente-wuerdesicherung/ veröffentlicht werden. Die Seite benötigt Inhaltsverzeichnis, Kapitelanker, Dossier-Download, Kontext-Werkzeuge, Buchanker, SDG-/SDG+-Referenzblock und Druckfunktion.</w:t>
+        <w:t>1. Zweck und Abgrenzung</w:t>
+      </w:r>
+    </w:p>
+    <w:p>
+      <w:r>
+        <w:t>Dieses Detailkonzept beschreibt den Unterbereich "Lebenswirkungs-Faktor und Berechnungslogik" als eigenständigen Baustein des Portals Rente &amp; soziale Sicherung. Es grenzt den Baustein von klassischen Rentenreformen ab und zeigt, wie er in die Wirkungsökonomie eingebettet wird.</w:t>
+      </w:r>
+    </w:p>
+    <w:p>
+      <w:pPr>
+        <w:pStyle w:val="Heading2"/>
+      </w:pPr>
+      <w:r>
+        <w:t>2. Alte Logik und Problemstruktur</w:t>
+      </w:r>
+    </w:p>
+    <w:p>
+      <w:r>
+        <w:t>Die heutige Rentenformel rechnet Beiträge präzise, aber Wirkung nur indirekt. Sie kann nicht erklären, warum gesellschaftlich unverzichtbare Tätigkeiten im Alter oft schlechter abgesichert sind als hoch bezahlte, aber wirkungsambivalente Tätigkeiten.</w:t>
+      </w:r>
+    </w:p>
+    <w:p>
+      <w:r>
+        <w:t>Die alte Logik behandelt Rente als nachgelagerte Auszahlung aus Erwerbs- und Beitragsbiografien. Das ist verwaltungstechnisch klar, aber wirkungsökonomisch unvollständig. Denn sie übersieht, ob eine Tätigkeit Folgekosten senkt, Vertrauen stärkt, Generationen verbindet, Pflege leistet oder Transformation ermöglicht. Ein wirkungsökonomisches Detailkonzept muss deshalb zwischen Einkommen, Beschäftigung, Leistung und Wirkung unterscheiden.</w:t>
+      </w:r>
+    </w:p>
+    <w:p>
+      <w:pPr>
+        <w:pStyle w:val="Heading2"/>
+      </w:pPr>
+      <w:r>
+        <w:t>3. Wirkungsökonomischer Perspektivwechsel</w:t>
+      </w:r>
+    </w:p>
+    <w:p>
+      <w:r>
+        <w:t>Der Lebenswirkungs-Faktor ergänzt die klassische Rentenlogik um eine begrenzte, transparente und überprüfbare Wirkungslogik. Er erhöht nicht beliebig, sondern korrigiert erkennbare Wirkungslücken, ohne die Würdegrenze zu unterschreiten.</w:t>
+      </w:r>
+    </w:p>
+    <w:p>
+      <w:r>
+        <w:t>Wirkungsökonomisch wird nicht gefragt, ob eine Person "mehr wert" ist. Gefragt wird, welche Zustände durch Lebensleistung, Institutionen und Systeme verbessert oder verschlechtert werden und wie ein soziales Sicherungssystem diese Wirklichkeit fairer abbilden kann. Dabei bleibt der Schutz vor Personenbewertung zentral.</w:t>
+      </w:r>
+    </w:p>
+    <w:p>
+      <w:pPr>
+        <w:pStyle w:val="Heading2"/>
+      </w:pPr>
+      <w:r>
+        <w:t>4. Unterkapitel und Struktur</w:t>
+      </w:r>
+    </w:p>
+    <w:p>
+      <w:pPr>
+        <w:pStyle w:val="Heading3"/>
+      </w:pPr>
+      <w:r>
+        <w:t>Arbeitsannahme v0.1 der Formel</w:t>
+      </w:r>
+    </w:p>
+    <w:p>
+      <w:r>
+        <w:t>Dieser Abschnitt untersucht arbeitsannahme v0.1 der formel im Zusammenhang mit Rente, sozialer Sicherung und positiver Netto-Wirkung. Er beschreibt, welche Informationen benötigt werden, welche Akteure betroffen sind, welche rechtlichen Grenzen bestehen und welche Gestaltungsspielräume politisch offen bleiben.</w:t>
+      </w:r>
+    </w:p>
+    <w:p>
+      <w:pPr>
+        <w:pStyle w:val="Heading3"/>
+      </w:pPr>
+      <w:r>
+        <w:t>Schutzkorridore und Begrenzungen</w:t>
+      </w:r>
+    </w:p>
+    <w:p>
+      <w:r>
+        <w:t>Dieser Abschnitt untersucht schutzkorridore und begrenzungen im Zusammenhang mit Rente, sozialer Sicherung und positiver Netto-Wirkung. Er beschreibt, welche Informationen benötigt werden, welche Akteure betroffen sind, welche rechtlichen Grenzen bestehen und welche Gestaltungsspielräume politisch offen bleiben.</w:t>
+      </w:r>
+    </w:p>
+    <w:p>
+      <w:pPr>
+        <w:pStyle w:val="Heading3"/>
+      </w:pPr>
+      <w:r>
+        <w:t>Positive, negative und neutrale Wirkung</w:t>
+      </w:r>
+    </w:p>
+    <w:p>
+      <w:r>
+        <w:t>Dieser Abschnitt untersucht positive, negative und neutrale wirkung im Zusammenhang mit Rente, sozialer Sicherung und positiver Netto-Wirkung. Er beschreibt, welche Informationen benötigt werden, welche Akteure betroffen sind, welche rechtlichen Grenzen bestehen und welche Gestaltungsspielräume politisch offen bleiben.</w:t>
+      </w:r>
+    </w:p>
+    <w:p>
+      <w:pPr>
+        <w:pStyle w:val="Heading3"/>
+      </w:pPr>
+      <w:r>
+        <w:t>Nicht-Kompensation bei roten Linien</w:t>
+      </w:r>
+    </w:p>
+    <w:p>
+      <w:r>
+        <w:t>Dieser Abschnitt untersucht nicht-kompensation bei roten linien im Zusammenhang mit Rente, sozialer Sicherung und positiver Netto-Wirkung. Er beschreibt, welche Informationen benötigt werden, welche Akteure betroffen sind, welche rechtlichen Grenzen bestehen und welche Gestaltungsspielräume politisch offen bleiben.</w:t>
+      </w:r>
+    </w:p>
+    <w:p>
+      <w:pPr>
+        <w:pStyle w:val="Heading3"/>
+      </w:pPr>
+      <w:r>
+        <w:t>Beispielrechnung und Unsicherheit</w:t>
+      </w:r>
+    </w:p>
+    <w:p>
+      <w:r>
+        <w:t>Dieser Abschnitt untersucht beispielrechnung und unsicherheit im Zusammenhang mit Rente, sozialer Sicherung und positiver Netto-Wirkung. Er beschreibt, welche Informationen benötigt werden, welche Akteure betroffen sind, welche rechtlichen Grenzen bestehen und welche Gestaltungsspielräume politisch offen bleiben.</w:t>
+      </w:r>
+    </w:p>
+    <w:p>
+      <w:pPr>
+        <w:pStyle w:val="Heading2"/>
+      </w:pPr>
+      <w:r>
+        <w:t>5. Daten, Indikatoren und WÖk-ID-Anschluss</w:t>
+      </w:r>
+    </w:p>
+    <w:p>
+      <w:r>
+        <w:t>Der Unterbereich benötigt eine Datenlogik, die aus bestehenden Quellen schöpft, aber nicht in Überwachung kippt. Mögliche Indikatorfamilien sind faire Arbeit und Einkommen, Sozialschutz, Care und Vereinbarkeit, Weiterbildung, Gesundheit, gesellschaftlicher Zusammenhalt, institutionelles Vertrauen, digitale Selbstbestimmung und Kapitalwirkung. WÖk-IDs dienen als Adresse der Wirkung, nicht als Personenetikett.</w:t>
+      </w:r>
+    </w:p>
+    <w:p>
+      <w:pPr>
+        <w:pStyle w:val="Heading2"/>
+      </w:pPr>
+      <w:r>
+        <w:t>6. Berechnungs- oder Bewertungslogik</w:t>
+      </w:r>
+    </w:p>
+    <w:p>
+      <w:r>
+        <w:t>Die Bewertungslogik ist modular: Zuerst wird die Würdeebene geschützt, danach werden klassische Ansprüche gesichert, erst dann werden Wirkungsboni oder Fondsanteile ergänzt. Bei unsicheren Daten gilt ein Vorsichtsprinzip. In der Pilotphase werden positive Wirkungen sichtbar gemacht, negative Systemwirkungen primär über Unternehmens-, Produkt-, Kapital- und Steuerinstrumente rückgekoppelt.</w:t>
+      </w:r>
+    </w:p>
+    <w:p>
+      <w:pPr>
+        <w:pStyle w:val="Heading2"/>
+      </w:pPr>
+      <w:r>
+        <w:t>7. Schutzlinien</w:t>
+      </w:r>
+    </w:p>
+    <w:p>
+      <w:pPr>
+        <w:pStyle w:val="ListBullet"/>
+      </w:pPr>
+      <w:r>
+        <w:t>Keine automatische Letztentscheidung.</w:t>
+      </w:r>
+    </w:p>
+    <w:p>
+      <w:pPr>
+        <w:pStyle w:val="ListBullet"/>
+      </w:pPr>
+      <w:r>
+        <w:t>Keine Absenkung unter die Würde- und Teilhabeebene.</w:t>
+      </w:r>
+    </w:p>
+    <w:p>
+      <w:pPr>
+        <w:pStyle w:val="ListBullet"/>
+      </w:pPr>
+      <w:r>
+        <w:t>Keine pauschale Bewertung von Personen nach Branchenzugehörigkeit.</w:t>
+      </w:r>
+    </w:p>
+    <w:p>
+      <w:pPr>
+        <w:pStyle w:val="ListBullet"/>
+      </w:pPr>
+      <w:r>
+        <w:t>Datensparsamkeit und Zweckbindung.</w:t>
+      </w:r>
+    </w:p>
+    <w:p>
+      <w:pPr>
+        <w:pStyle w:val="ListBullet"/>
+      </w:pPr>
+      <w:r>
+        <w:t>Recht auf Auskunft, Korrektur und Widerspruch.</w:t>
+      </w:r>
+    </w:p>
+    <w:p>
+      <w:pPr>
+        <w:pStyle w:val="ListBullet"/>
+      </w:pPr>
+      <w:r>
+        <w:t>Parlamentarische und gerichtliche Kontrolle.</w:t>
+      </w:r>
+    </w:p>
+    <w:p>
+      <w:pPr>
+        <w:pStyle w:val="Heading2"/>
+      </w:pPr>
+      <w:r>
+        <w:t>8. Politische Anschlussfähigkeit</w:t>
+      </w:r>
+    </w:p>
+    <w:p>
+      <w:r>
+        <w:t>Der Baustein ist politisch offen. Er kann konservativ als Anerkennung von Lebensleistung, sozialdemokratisch als soziale Sicherheit, liberal als Eigenverantwortung mit transparenten Anreizen, grün als Zukunftsinvestition, links als Schutz vor Altersarmut, kommunal als Teilhabeinstrument oder wirtschaftsnah als Resilienzfaktor interpretiert werden. Die Wirkungsökonomie gibt den Rahmen, nicht die parteipolitische Detailentscheidung vor.</w:t>
+      </w:r>
+    </w:p>
+    <w:p>
+      <w:pPr>
+        <w:pStyle w:val="Heading2"/>
+      </w:pPr>
+      <w:r>
+        <w:t>9. SDG-/SDG+-Bezug</w:t>
+      </w:r>
+    </w:p>
+    <w:p>
+      <w:r>
+        <w:t>SDG 1, SDG 8, SDG 10, SDG 16, SDG+ Rechtsstaatlichkeit</w:t>
       </w:r>
     </w:p>
     <w:p>
@@ -844,7 +1299,7 @@
         <w:pStyle w:val="Heading1"/>
       </w:pPr>
       <w:r>
-        <w:t>3. Lebenswirkungs-Konto und Wirkungsbiografie</w:t>
+        <w:t>5. Care, Bildung, Pflege, Ehrenamt und Wirkleistung</w:t>
       </w:r>
     </w:p>
     <w:p>
@@ -857,7 +1312,7 @@
     </w:p>
     <w:p>
       <w:r>
-        <w:t>Dieses Detailkonzept beschreibt den Unterbereich "Lebenswirkungs-Konto und Wirkungsbiografie" als eigenständigen Baustein des Portals Rente &amp; soziale Sicherung. Es grenzt den Baustein von klassischen Rentenreformen ab und zeigt, wie er in die Wirkungsökonomie eingebettet wird.</w:t>
+        <w:t>Dieses Detailkonzept beschreibt den Unterbereich "Care, Bildung, Pflege, Ehrenamt und Wirkleistung" als eigenständigen Baustein des Portals Rente &amp; soziale Sicherung. Es grenzt den Baustein von klassischen Rentenreformen ab und zeigt, wie er in die Wirkungsökonomie eingebettet wird.</w:t>
       </w:r>
     </w:p>
     <w:p>
@@ -870,7 +1325,7 @@
     </w:p>
     <w:p>
       <w:r>
-        <w:t>Lebensläufe werden rentenrechtlich häufig als Beitrags-, Versicherungs- und Lückenbiografien gelesen. Diese Sicht erkennt Tätigkeiten nur unvollständig, die nicht gut bezahlt sind, aber Zustände verbessern.</w:t>
+        <w:t>Care, Bildung, Pflege, Ehrenamt, kulturelle Arbeit und demokratisches Engagement erzeugen Stabilität, werden aber oft schlechter bezahlt oder gar nicht entlohnt. Das erzeugt Rentenlücken und schwächt Vertrauen in das Leistungsprinzip.</w:t>
       </w:r>
     </w:p>
     <w:p>
@@ -888,7 +1343,7 @@
     </w:p>
     <w:p>
       <w:r>
-        <w:t>Das Lebenswirkungs-Konto macht Wirkung über den Lebenslauf sichtbar, ohne Menschen zu bewerten. Es dokumentiert anerkannte Wirkungsräume, Qualifikationen, Care-Zeiten, Engagement, Transformationsbeiträge und Belastungen als Grundlage für Transparenz und Fairness.</w:t>
+        <w:t>Die Wirkungsrente erkennt nicht-marktliche und unterbewertete Wirkleistung als systemische Leistung an. Sie unterscheidet dabei zwischen echter Wirkleistung, bloßer Aktivität und symbolischer Behauptung.</w:t>
       </w:r>
     </w:p>
     <w:p>
@@ -909,12 +1364,12 @@
         <w:pStyle w:val="Heading3"/>
       </w:pPr>
       <w:r>
-        <w:t>Was gespeichert wird - und was nicht</w:t>
-      </w:r>
-    </w:p>
-    <w:p>
-      <w:r>
-        <w:t>Dieser Abschnitt untersucht was gespeichert wird - und was nicht im Zusammenhang mit Rente, sozialer Sicherung und positiver Netto-Wirkung. Er beschreibt, welche Informationen benötigt werden, welche Akteure betroffen sind, welche rechtlichen Grenzen bestehen und welche Gestaltungsspielräume politisch offen bleiben.</w:t>
+        <w:t>Care als Infrastrukturleistung</w:t>
+      </w:r>
+    </w:p>
+    <w:p>
+      <w:r>
+        <w:t>Dieser Abschnitt untersucht care als infrastrukturleistung im Zusammenhang mit Rente, sozialer Sicherung und positiver Netto-Wirkung. Er beschreibt, welche Informationen benötigt werden, welche Akteure betroffen sind, welche rechtlichen Grenzen bestehen und welche Gestaltungsspielräume politisch offen bleiben.</w:t>
       </w:r>
     </w:p>
     <w:p>
@@ -922,12 +1377,12 @@
         <w:pStyle w:val="Heading3"/>
       </w:pPr>
       <w:r>
-        <w:t>Keine Personenbewertung, kein Social Credit</w:t>
-      </w:r>
-    </w:p>
-    <w:p>
-      <w:r>
-        <w:t>Dieser Abschnitt untersucht keine personenbewertung, kein social credit im Zusammenhang mit Rente, sozialer Sicherung und positiver Netto-Wirkung. Er beschreibt, welche Informationen benötigt werden, welche Akteure betroffen sind, welche rechtlichen Grenzen bestehen und welche Gestaltungsspielräume politisch offen bleiben.</w:t>
+        <w:t>Bildung und Prävention als Zukunftswirkung</w:t>
+      </w:r>
+    </w:p>
+    <w:p>
+      <w:r>
+        <w:t>Dieser Abschnitt untersucht bildung und prävention als zukunftswirkung im Zusammenhang mit Rente, sozialer Sicherung und positiver Netto-Wirkung. Er beschreibt, welche Informationen benötigt werden, welche Akteure betroffen sind, welche rechtlichen Grenzen bestehen und welche Gestaltungsspielräume politisch offen bleiben.</w:t>
       </w:r>
     </w:p>
     <w:p>
@@ -935,12 +1390,12 @@
         <w:pStyle w:val="Heading3"/>
       </w:pPr>
       <w:r>
-        <w:t>Anerkennungsfelder und Nachweise</w:t>
-      </w:r>
-    </w:p>
-    <w:p>
-      <w:r>
-        <w:t>Dieser Abschnitt untersucht anerkennungsfelder und nachweise im Zusammenhang mit Rente, sozialer Sicherung und positiver Netto-Wirkung. Er beschreibt, welche Informationen benötigt werden, welche Akteure betroffen sind, welche rechtlichen Grenzen bestehen und welche Gestaltungsspielräume politisch offen bleiben.</w:t>
+        <w:t>Ehrenamt und Demokratiearbeit</w:t>
+      </w:r>
+    </w:p>
+    <w:p>
+      <w:r>
+        <w:t>Dieser Abschnitt untersucht ehrenamt und demokratiearbeit im Zusammenhang mit Rente, sozialer Sicherung und positiver Netto-Wirkung. Er beschreibt, welche Informationen benötigt werden, welche Akteure betroffen sind, welche rechtlichen Grenzen bestehen und welche Gestaltungsspielräume politisch offen bleiben.</w:t>
       </w:r>
     </w:p>
     <w:p>
@@ -948,12 +1403,12 @@
         <w:pStyle w:val="Heading3"/>
       </w:pPr>
       <w:r>
-        <w:t>Datenschutz und Recht auf Korrektur</w:t>
-      </w:r>
-    </w:p>
-    <w:p>
-      <w:r>
-        <w:t>Dieser Abschnitt untersucht datenschutz und recht auf korrektur im Zusammenhang mit Rente, sozialer Sicherung und positiver Netto-Wirkung. Er beschreibt, welche Informationen benötigt werden, welche Akteure betroffen sind, welche rechtlichen Grenzen bestehen und welche Gestaltungsspielräume politisch offen bleiben.</w:t>
+        <w:t>Nachweise ohne Bürokratiewut</w:t>
+      </w:r>
+    </w:p>
+    <w:p>
+      <w:r>
+        <w:t>Dieser Abschnitt untersucht nachweise ohne bürokratiewut im Zusammenhang mit Rente, sozialer Sicherung und positiver Netto-Wirkung. Er beschreibt, welche Informationen benötigt werden, welche Akteure betroffen sind, welche rechtlichen Grenzen bestehen und welche Gestaltungsspielräume politisch offen bleiben.</w:t>
       </w:r>
     </w:p>
     <w:p>
@@ -961,12 +1416,12 @@
         <w:pStyle w:val="Heading3"/>
       </w:pPr>
       <w:r>
-        <w:t>Online- und Offline-Zugänglichkeit</w:t>
-      </w:r>
-    </w:p>
-    <w:p>
-      <w:r>
-        <w:t>Dieser Abschnitt untersucht online- und offline-zugänglichkeit im Zusammenhang mit Rente, sozialer Sicherung und positiver Netto-Wirkung. Er beschreibt, welche Informationen benötigt werden, welche Akteure betroffen sind, welche rechtlichen Grenzen bestehen und welche Gestaltungsspielräume politisch offen bleiben.</w:t>
+        <w:t>Gender Pension Gap und Care-Gerechtigkeit</w:t>
+      </w:r>
+    </w:p>
+    <w:p>
+      <w:r>
+        <w:t>Dieser Abschnitt untersucht gender pension gap und care-gerechtigkeit im Zusammenhang mit Rente, sozialer Sicherung und positiver Netto-Wirkung. Er beschreibt, welche Informationen benötigt werden, welche Akteure betroffen sind, welche rechtlichen Grenzen bestehen und welche Gestaltungsspielräume politisch offen bleiben.</w:t>
       </w:r>
     </w:p>
     <w:p>
@@ -1074,7 +1529,20 @@
     </w:p>
     <w:p>
       <w:r>
-        <w:t>SDG 4, SDG 5, SDG 8, SDG 10, SDG 16, SDG+ digitale Selbstbestimmung</w:t>
+        <w:t>SDG 3, SDG 4, SDG 5, SDG 10, SDG 16, SDG+ Demokratie</w:t>
+      </w:r>
+    </w:p>
+    <w:p>
+      <w:r>
+        <w:br w:type="page"/>
+      </w:r>
+    </w:p>
+    <w:p>
+      <w:pPr>
+        <w:pStyle w:val="Heading1"/>
+      </w:pPr>
+      <w:r>
+        <w:t>6. Automatisierung, Sozialabgaben-Entkopplung und Wirkungsdividende</w:t>
       </w:r>
     </w:p>
     <w:p>
@@ -1082,12 +1550,229 @@
         <w:pStyle w:val="Heading2"/>
       </w:pPr>
       <w:r>
-        <w:t>10. Online-Umsetzung</w:t>
-      </w:r>
-    </w:p>
-    <w:p>
-      <w:r>
-        <w:t>Dieses Detailkonzept sollte online unter /wirkungsfelder/rente-soziale-sicherung/lebenswirkungs-konto/ veröffentlicht werden. Die Seite benötigt Inhaltsverzeichnis, Kapitelanker, Dossier-Download, Kontext-Werkzeuge, Buchanker, SDG-/SDG+-Referenzblock und Druckfunktion.</w:t>
+        <w:t>1. Zweck und Abgrenzung</w:t>
+      </w:r>
+    </w:p>
+    <w:p>
+      <w:r>
+        <w:t>Dieses Detailkonzept beschreibt den Unterbereich "Automatisierung, Sozialabgaben-Entkopplung und Wirkungsdividende" als eigenständigen Baustein des Portals Rente &amp; soziale Sicherung. Es grenzt den Baustein von klassischen Rentenreformen ab und zeigt, wie er in die Wirkungsökonomie eingebettet wird.</w:t>
+      </w:r>
+    </w:p>
+    <w:p>
+      <w:pPr>
+        <w:pStyle w:val="Heading2"/>
+      </w:pPr>
+      <w:r>
+        <w:t>2. Alte Logik und Problemstruktur</w:t>
+      </w:r>
+    </w:p>
+    <w:p>
+      <w:r>
+        <w:t>Wenn Maschinen, KI und Plattformen mehr produktive Arbeit übernehmen, bricht die Kette Arbeit - Einkommen - Sozialabgaben - Rentenfinanzierung. Eine Ordnung, die soziale Sicherung an menschliche Lohnarbeit bindet, wird dadurch instabil.</w:t>
+      </w:r>
+    </w:p>
+    <w:p>
+      <w:r>
+        <w:t>Die alte Logik behandelt Rente als nachgelagerte Auszahlung aus Erwerbs- und Beitragsbiografien. Das ist verwaltungstechnisch klar, aber wirkungsökonomisch unvollständig. Denn sie übersieht, ob eine Tätigkeit Folgekosten senkt, Vertrauen stärkt, Generationen verbindet, Pflege leistet oder Transformation ermöglicht. Ein wirkungsökonomisches Detailkonzept muss deshalb zwischen Einkommen, Beschäftigung, Leistung und Wirkung unterscheiden.</w:t>
+      </w:r>
+    </w:p>
+    <w:p>
+      <w:pPr>
+        <w:pStyle w:val="Heading2"/>
+      </w:pPr>
+      <w:r>
+        <w:t>3. Wirkungsökonomischer Perspektivwechsel</w:t>
+      </w:r>
+    </w:p>
+    <w:p>
+      <w:r>
+        <w:t>Die Wirkungsökonomie entkoppelt die Finanzierungsbasis sozialer Sicherung schrittweise von menschlicher Arbeitsleistung. Automatisierte Wertschöpfung wird nicht bestraft, sondern gesellschaftlich rückgekoppelt: in Wirkungsfonds, Wirkungsdividende und sozial stabile Übergänge.</w:t>
+      </w:r>
+    </w:p>
+    <w:p>
+      <w:r>
+        <w:t>Wirkungsökonomisch wird nicht gefragt, ob eine Person "mehr wert" ist. Gefragt wird, welche Zustände durch Lebensleistung, Institutionen und Systeme verbessert oder verschlechtert werden und wie ein soziales Sicherungssystem diese Wirklichkeit fairer abbilden kann. Dabei bleibt der Schutz vor Personenbewertung zentral.</w:t>
+      </w:r>
+    </w:p>
+    <w:p>
+      <w:pPr>
+        <w:pStyle w:val="Heading2"/>
+      </w:pPr>
+      <w:r>
+        <w:t>4. Unterkapitel und Struktur</w:t>
+      </w:r>
+    </w:p>
+    <w:p>
+      <w:pPr>
+        <w:pStyle w:val="Heading3"/>
+      </w:pPr>
+      <w:r>
+        <w:t>Warum Robotersteuer allein zu kurz greift</w:t>
+      </w:r>
+    </w:p>
+    <w:p>
+      <w:r>
+        <w:t>Dieser Abschnitt untersucht warum robotersteuer allein zu kurz greift im Zusammenhang mit Rente, sozialer Sicherung und positiver Netto-Wirkung. Er beschreibt, welche Informationen benötigt werden, welche Akteure betroffen sind, welche rechtlichen Grenzen bestehen und welche Gestaltungsspielräume politisch offen bleiben.</w:t>
+      </w:r>
+    </w:p>
+    <w:p>
+      <w:pPr>
+        <w:pStyle w:val="Heading3"/>
+      </w:pPr>
+      <w:r>
+        <w:t>Maschinenleistung als Wertschöpfungsquelle</w:t>
+      </w:r>
+    </w:p>
+    <w:p>
+      <w:r>
+        <w:t>Dieser Abschnitt untersucht maschinenleistung als wertschöpfungsquelle im Zusammenhang mit Rente, sozialer Sicherung und positiver Netto-Wirkung. Er beschreibt, welche Informationen benötigt werden, welche Akteure betroffen sind, welche rechtlichen Grenzen bestehen und welche Gestaltungsspielräume politisch offen bleiben.</w:t>
+      </w:r>
+    </w:p>
+    <w:p>
+      <w:pPr>
+        <w:pStyle w:val="Heading3"/>
+      </w:pPr>
+      <w:r>
+        <w:t>Sozialabgaben-Entkopplung</w:t>
+      </w:r>
+    </w:p>
+    <w:p>
+      <w:r>
+        <w:t>Dieser Abschnitt untersucht sozialabgaben-entkopplung im Zusammenhang mit Rente, sozialer Sicherung und positiver Netto-Wirkung. Er beschreibt, welche Informationen benötigt werden, welche Akteure betroffen sind, welche rechtlichen Grenzen bestehen und welche Gestaltungsspielräume politisch offen bleiben.</w:t>
+      </w:r>
+    </w:p>
+    <w:p>
+      <w:pPr>
+        <w:pStyle w:val="Heading3"/>
+      </w:pPr>
+      <w:r>
+        <w:t>Wirkungsdividende als systemischer Anspruch</w:t>
+      </w:r>
+    </w:p>
+    <w:p>
+      <w:r>
+        <w:t>Dieser Abschnitt untersucht wirkungsdividende als systemischer anspruch im Zusammenhang mit Rente, sozialer Sicherung und positiver Netto-Wirkung. Er beschreibt, welche Informationen benötigt werden, welche Akteure betroffen sind, welche rechtlichen Grenzen bestehen und welche Gestaltungsspielräume politisch offen bleiben.</w:t>
+      </w:r>
+    </w:p>
+    <w:p>
+      <w:pPr>
+        <w:pStyle w:val="Heading3"/>
+      </w:pPr>
+      <w:r>
+        <w:t>Übergänge für Unternehmen und Beschäftigte</w:t>
+      </w:r>
+    </w:p>
+    <w:p>
+      <w:r>
+        <w:t>Dieser Abschnitt untersucht übergänge für unternehmen und beschäftigte im Zusammenhang mit Rente, sozialer Sicherung und positiver Netto-Wirkung. Er beschreibt, welche Informationen benötigt werden, welche Akteure betroffen sind, welche rechtlichen Grenzen bestehen und welche Gestaltungsspielräume politisch offen bleiben.</w:t>
+      </w:r>
+    </w:p>
+    <w:p>
+      <w:pPr>
+        <w:pStyle w:val="Heading2"/>
+      </w:pPr>
+      <w:r>
+        <w:t>5. Daten, Indikatoren und WÖk-ID-Anschluss</w:t>
+      </w:r>
+    </w:p>
+    <w:p>
+      <w:r>
+        <w:t>Der Unterbereich benötigt eine Datenlogik, die aus bestehenden Quellen schöpft, aber nicht in Überwachung kippt. Mögliche Indikatorfamilien sind faire Arbeit und Einkommen, Sozialschutz, Care und Vereinbarkeit, Weiterbildung, Gesundheit, gesellschaftlicher Zusammenhalt, institutionelles Vertrauen, digitale Selbstbestimmung und Kapitalwirkung. WÖk-IDs dienen als Adresse der Wirkung, nicht als Personenetikett.</w:t>
+      </w:r>
+    </w:p>
+    <w:p>
+      <w:pPr>
+        <w:pStyle w:val="Heading2"/>
+      </w:pPr>
+      <w:r>
+        <w:t>6. Berechnungs- oder Bewertungslogik</w:t>
+      </w:r>
+    </w:p>
+    <w:p>
+      <w:r>
+        <w:t>Die Bewertungslogik ist modular: Zuerst wird die Würdeebene geschützt, danach werden klassische Ansprüche gesichert, erst dann werden Wirkungsboni oder Fondsanteile ergänzt. Bei unsicheren Daten gilt ein Vorsichtsprinzip. In der Pilotphase werden positive Wirkungen sichtbar gemacht, negative Systemwirkungen primär über Unternehmens-, Produkt-, Kapital- und Steuerinstrumente rückgekoppelt.</w:t>
+      </w:r>
+    </w:p>
+    <w:p>
+      <w:pPr>
+        <w:pStyle w:val="Heading2"/>
+      </w:pPr>
+      <w:r>
+        <w:t>7. Schutzlinien</w:t>
+      </w:r>
+    </w:p>
+    <w:p>
+      <w:pPr>
+        <w:pStyle w:val="ListBullet"/>
+      </w:pPr>
+      <w:r>
+        <w:t>Keine automatische Letztentscheidung.</w:t>
+      </w:r>
+    </w:p>
+    <w:p>
+      <w:pPr>
+        <w:pStyle w:val="ListBullet"/>
+      </w:pPr>
+      <w:r>
+        <w:t>Keine Absenkung unter die Würde- und Teilhabeebene.</w:t>
+      </w:r>
+    </w:p>
+    <w:p>
+      <w:pPr>
+        <w:pStyle w:val="ListBullet"/>
+      </w:pPr>
+      <w:r>
+        <w:t>Keine pauschale Bewertung von Personen nach Branchenzugehörigkeit.</w:t>
+      </w:r>
+    </w:p>
+    <w:p>
+      <w:pPr>
+        <w:pStyle w:val="ListBullet"/>
+      </w:pPr>
+      <w:r>
+        <w:t>Datensparsamkeit und Zweckbindung.</w:t>
+      </w:r>
+    </w:p>
+    <w:p>
+      <w:pPr>
+        <w:pStyle w:val="ListBullet"/>
+      </w:pPr>
+      <w:r>
+        <w:t>Recht auf Auskunft, Korrektur und Widerspruch.</w:t>
+      </w:r>
+    </w:p>
+    <w:p>
+      <w:pPr>
+        <w:pStyle w:val="ListBullet"/>
+      </w:pPr>
+      <w:r>
+        <w:t>Parlamentarische und gerichtliche Kontrolle.</w:t>
+      </w:r>
+    </w:p>
+    <w:p>
+      <w:pPr>
+        <w:pStyle w:val="Heading2"/>
+      </w:pPr>
+      <w:r>
+        <w:t>8. Politische Anschlussfähigkeit</w:t>
+      </w:r>
+    </w:p>
+    <w:p>
+      <w:r>
+        <w:t>Der Baustein ist politisch offen. Er kann konservativ als Anerkennung von Lebensleistung, sozialdemokratisch als soziale Sicherheit, liberal als Eigenverantwortung mit transparenten Anreizen, grün als Zukunftsinvestition, links als Schutz vor Altersarmut, kommunal als Teilhabeinstrument oder wirtschaftsnah als Resilienzfaktor interpretiert werden. Die Wirkungsökonomie gibt den Rahmen, nicht die parteipolitische Detailentscheidung vor.</w:t>
+      </w:r>
+    </w:p>
+    <w:p>
+      <w:pPr>
+        <w:pStyle w:val="Heading2"/>
+      </w:pPr>
+      <w:r>
+        <w:t>9. SDG-/SDG+-Bezug</w:t>
+      </w:r>
+    </w:p>
+    <w:p>
+      <w:r>
+        <w:t>SDG 8, SDG 9, SDG 10, SDG 16, SDG+ institutionelles Vertrauen</w:t>
       </w:r>
     </w:p>
     <w:p>
@@ -1100,7 +1785,7 @@
         <w:pStyle w:val="Heading1"/>
       </w:pPr>
       <w:r>
-        <w:t>4. Lebenswirkungs-Faktor und Berechnungslogik</w:t>
+        <w:t>7. Renten-Impact-Fonds und Wirkungsfondsarchitektur</w:t>
       </w:r>
     </w:p>
     <w:p>
@@ -1113,7 +1798,7 @@
     </w:p>
     <w:p>
       <w:r>
-        <w:t>Dieses Detailkonzept beschreibt den Unterbereich "Lebenswirkungs-Faktor und Berechnungslogik" als eigenständigen Baustein des Portals Rente &amp; soziale Sicherung. Es grenzt den Baustein von klassischen Rentenreformen ab und zeigt, wie er in die Wirkungsökonomie eingebettet wird.</w:t>
+        <w:t>Dieses Detailkonzept beschreibt den Unterbereich "Renten-Impact-Fonds und Wirkungsfondsarchitektur" als eigenständigen Baustein des Portals Rente &amp; soziale Sicherung. Es grenzt den Baustein von klassischen Rentenreformen ab und zeigt, wie er in die Wirkungsökonomie eingebettet wird.</w:t>
       </w:r>
     </w:p>
     <w:p>
@@ -1126,7 +1811,7 @@
     </w:p>
     <w:p>
       <w:r>
-        <w:t>Die heutige Rentenformel rechnet Beiträge präzise, aber Wirkung nur indirekt. Sie kann nicht erklären, warum gesellschaftlich unverzichtbare Tätigkeiten im Alter oft schlechter abgesichert sind als hoch bezahlte, aber wirkungsambivalente Tätigkeiten.</w:t>
+        <w:t>Kapitalgedeckte Altersvorsorge kann alte Fehler wiederholen, wenn sie Rendite aus zerstörerischen Geschäftsmodellen bezieht. Dann finanziert Altersvorsorge die Risiken, die künftige Generationen tragen müssen.</w:t>
       </w:r>
     </w:p>
     <w:p>
@@ -1144,7 +1829,7 @@
     </w:p>
     <w:p>
       <w:r>
-        <w:t>Der Lebenswirkungs-Faktor ergänzt die klassische Rentenlogik um eine begrenzte, transparente und überprüfbare Wirkungslogik. Er erhöht nicht beliebig, sondern korrigiert erkennbare Wirkungslücken, ohne die Würdegrenze zu unterschreiten.</w:t>
+        <w:t>Wirkungsfonds investieren Kapital nach positiver Netto-Wirkung. Der Renten-Impact-Fonds wird nicht als Spekulationsinstrument verstanden, sondern als Transformations- und Stabilitätsinstrument für Bildung, Gesundheit, Wohnen, Klima, Pflege, Demokratie und Infrastruktur.</w:t>
       </w:r>
     </w:p>
     <w:p>
@@ -1165,12 +1850,12 @@
         <w:pStyle w:val="Heading3"/>
       </w:pPr>
       <w:r>
-        <w:t>Arbeitsannahme v0.1 der Formel</w:t>
-      </w:r>
-    </w:p>
-    <w:p>
-      <w:r>
-        <w:t>Dieser Abschnitt untersucht arbeitsannahme v0.1 der formel im Zusammenhang mit Rente, sozialer Sicherung und positiver Netto-Wirkung. Er beschreibt, welche Informationen benötigt werden, welche Akteure betroffen sind, welche rechtlichen Grenzen bestehen und welche Gestaltungsspielräume politisch offen bleiben.</w:t>
+        <w:t>Kapital als Werkzeug, nicht Ziel</w:t>
+      </w:r>
+    </w:p>
+    <w:p>
+      <w:r>
+        <w:t>Dieser Abschnitt untersucht kapital als werkzeug, nicht ziel im Zusammenhang mit Rente, sozialer Sicherung und positiver Netto-Wirkung. Er beschreibt, welche Informationen benötigt werden, welche Akteure betroffen sind, welche rechtlichen Grenzen bestehen und welche Gestaltungsspielräume politisch offen bleiben.</w:t>
       </w:r>
     </w:p>
     <w:p>
@@ -1178,12 +1863,12 @@
         <w:pStyle w:val="Heading3"/>
       </w:pPr>
       <w:r>
-        <w:t>Schutzkorridore und Begrenzungen</w:t>
-      </w:r>
-    </w:p>
-    <w:p>
-      <w:r>
-        <w:t>Dieser Abschnitt untersucht schutzkorridore und begrenzungen im Zusammenhang mit Rente, sozialer Sicherung und positiver Netto-Wirkung. Er beschreibt, welche Informationen benötigt werden, welche Akteure betroffen sind, welche rechtlichen Grenzen bestehen und welche Gestaltungsspielräume politisch offen bleiben.</w:t>
+        <w:t>Fondsquellen und Mittelverwendung</w:t>
+      </w:r>
+    </w:p>
+    <w:p>
+      <w:r>
+        <w:t>Dieser Abschnitt untersucht fondsquellen und mittelverwendung im Zusammenhang mit Rente, sozialer Sicherung und positiver Netto-Wirkung. Er beschreibt, welche Informationen benötigt werden, welche Akteure betroffen sind, welche rechtlichen Grenzen bestehen und welche Gestaltungsspielräume politisch offen bleiben.</w:t>
       </w:r>
     </w:p>
     <w:p>
@@ -1191,12 +1876,12 @@
         <w:pStyle w:val="Heading3"/>
       </w:pPr>
       <w:r>
-        <w:t>Positive, negative und neutrale Wirkung</w:t>
-      </w:r>
-    </w:p>
-    <w:p>
-      <w:r>
-        <w:t>Dieser Abschnitt untersucht positive, negative und neutrale wirkung im Zusammenhang mit Rente, sozialer Sicherung und positiver Netto-Wirkung. Er beschreibt, welche Informationen benötigt werden, welche Akteure betroffen sind, welche rechtlichen Grenzen bestehen und welche Gestaltungsspielräume politisch offen bleiben.</w:t>
+        <w:t>Investitionskriterien und Ausschlüsse</w:t>
+      </w:r>
+    </w:p>
+    <w:p>
+      <w:r>
+        <w:t>Dieser Abschnitt untersucht investitionskriterien und ausschlüsse im Zusammenhang mit Rente, sozialer Sicherung und positiver Netto-Wirkung. Er beschreibt, welche Informationen benötigt werden, welche Akteure betroffen sind, welche rechtlichen Grenzen bestehen und welche Gestaltungsspielräume politisch offen bleiben.</w:t>
       </w:r>
     </w:p>
     <w:p>
@@ -1204,12 +1889,12 @@
         <w:pStyle w:val="Heading3"/>
       </w:pPr>
       <w:r>
-        <w:t>Nicht-Kompensation bei roten Linien</w:t>
-      </w:r>
-    </w:p>
-    <w:p>
-      <w:r>
-        <w:t>Dieser Abschnitt untersucht nicht-kompensation bei roten linien im Zusammenhang mit Rente, sozialer Sicherung und positiver Netto-Wirkung. Er beschreibt, welche Informationen benötigt werden, welche Akteure betroffen sind, welche rechtlichen Grenzen bestehen und welche Gestaltungsspielräume politisch offen bleiben.</w:t>
+        <w:t>Rendite als Folge positiver Wirkung</w:t>
+      </w:r>
+    </w:p>
+    <w:p>
+      <w:r>
+        <w:t>Dieser Abschnitt untersucht rendite als folge positiver wirkung im Zusammenhang mit Rente, sozialer Sicherung und positiver Netto-Wirkung. Er beschreibt, welche Informationen benötigt werden, welche Akteure betroffen sind, welche rechtlichen Grenzen bestehen und welche Gestaltungsspielräume politisch offen bleiben.</w:t>
       </w:r>
     </w:p>
     <w:p>
@@ -1217,12 +1902,12 @@
         <w:pStyle w:val="Heading3"/>
       </w:pPr>
       <w:r>
-        <w:t>Beispielrechnung und Unsicherheit</w:t>
-      </w:r>
-    </w:p>
-    <w:p>
-      <w:r>
-        <w:t>Dieser Abschnitt untersucht beispielrechnung und unsicherheit im Zusammenhang mit Rente, sozialer Sicherung und positiver Netto-Wirkung. Er beschreibt, welche Informationen benötigt werden, welche Akteure betroffen sind, welche rechtlichen Grenzen bestehen und welche Gestaltungsspielräume politisch offen bleiben.</w:t>
+        <w:t>Governance und Wirkungsrat</w:t>
+      </w:r>
+    </w:p>
+    <w:p>
+      <w:r>
+        <w:t>Dieser Abschnitt untersucht governance und wirkungsrat im Zusammenhang mit Rente, sozialer Sicherung und positiver Netto-Wirkung. Er beschreibt, welche Informationen benötigt werden, welche Akteure betroffen sind, welche rechtlichen Grenzen bestehen und welche Gestaltungsspielräume politisch offen bleiben.</w:t>
       </w:r>
     </w:p>
     <w:p>
@@ -1330,7 +2015,20 @@
     </w:p>
     <w:p>
       <w:r>
-        <w:t>SDG 1, SDG 8, SDG 10, SDG 16, SDG+ Rechtsstaatlichkeit</w:t>
+        <w:t>SDG 1, SDG 3, SDG 9, SDG 10, SDG 11, SDG 13, SDG 16, SDG 17</w:t>
+      </w:r>
+    </w:p>
+    <w:p>
+      <w:r>
+        <w:br w:type="page"/>
+      </w:r>
+    </w:p>
+    <w:p>
+      <w:pPr>
+        <w:pStyle w:val="Heading1"/>
+      </w:pPr>
+      <w:r>
+        <w:t>8. Betriebliche und private Vorsorge nach Wirkung</w:t>
       </w:r>
     </w:p>
     <w:p>
@@ -1338,12 +2036,229 @@
         <w:pStyle w:val="Heading2"/>
       </w:pPr>
       <w:r>
-        <w:t>10. Online-Umsetzung</w:t>
-      </w:r>
-    </w:p>
-    <w:p>
-      <w:r>
-        <w:t>Dieses Detailkonzept sollte online unter /wirkungsfelder/rente-soziale-sicherung/lebenswirkungs-faktor/ veröffentlicht werden. Die Seite benötigt Inhaltsverzeichnis, Kapitelanker, Dossier-Download, Kontext-Werkzeuge, Buchanker, SDG-/SDG+-Referenzblock und Druckfunktion.</w:t>
+        <w:t>1. Zweck und Abgrenzung</w:t>
+      </w:r>
+    </w:p>
+    <w:p>
+      <w:r>
+        <w:t>Dieses Detailkonzept beschreibt den Unterbereich "Betriebliche und private Vorsorge nach Wirkung" als eigenständigen Baustein des Portals Rente &amp; soziale Sicherung. Es grenzt den Baustein von klassischen Rentenreformen ab und zeigt, wie er in die Wirkungsökonomie eingebettet wird.</w:t>
+      </w:r>
+    </w:p>
+    <w:p>
+      <w:pPr>
+        <w:pStyle w:val="Heading2"/>
+      </w:pPr>
+      <w:r>
+        <w:t>2. Alte Logik und Problemstruktur</w:t>
+      </w:r>
+    </w:p>
+    <w:p>
+      <w:r>
+        <w:t>Betriebliche und private Vorsorge können individuelle Sicherheit stärken, aber auch Wirkungslücken erzeugen, wenn Kapitalanlagen nach Rendite ohne Wirkungswahrheit gesteuert werden.</w:t>
+      </w:r>
+    </w:p>
+    <w:p>
+      <w:r>
+        <w:t>Die alte Logik behandelt Rente als nachgelagerte Auszahlung aus Erwerbs- und Beitragsbiografien. Das ist verwaltungstechnisch klar, aber wirkungsökonomisch unvollständig. Denn sie übersieht, ob eine Tätigkeit Folgekosten senkt, Vertrauen stärkt, Generationen verbindet, Pflege leistet oder Transformation ermöglicht. Ein wirkungsökonomisches Detailkonzept muss deshalb zwischen Einkommen, Beschäftigung, Leistung und Wirkung unterscheiden.</w:t>
+      </w:r>
+    </w:p>
+    <w:p>
+      <w:pPr>
+        <w:pStyle w:val="Heading2"/>
+      </w:pPr>
+      <w:r>
+        <w:t>3. Wirkungsökonomischer Perspektivwechsel</w:t>
+      </w:r>
+    </w:p>
+    <w:p>
+      <w:r>
+        <w:t>Die Wirkungsökonomie ordnet betriebliche und private Vorsorge nicht ab, sondern richtet sie neu aus: Transparente Kapitalwirkung, faire Kosten, soziale Zugänglichkeit und Resilienz werden zu Qualitätskriterien.</w:t>
+      </w:r>
+    </w:p>
+    <w:p>
+      <w:r>
+        <w:t>Wirkungsökonomisch wird nicht gefragt, ob eine Person "mehr wert" ist. Gefragt wird, welche Zustände durch Lebensleistung, Institutionen und Systeme verbessert oder verschlechtert werden und wie ein soziales Sicherungssystem diese Wirklichkeit fairer abbilden kann. Dabei bleibt der Schutz vor Personenbewertung zentral.</w:t>
+      </w:r>
+    </w:p>
+    <w:p>
+      <w:pPr>
+        <w:pStyle w:val="Heading2"/>
+      </w:pPr>
+      <w:r>
+        <w:t>4. Unterkapitel und Struktur</w:t>
+      </w:r>
+    </w:p>
+    <w:p>
+      <w:pPr>
+        <w:pStyle w:val="Heading3"/>
+      </w:pPr>
+      <w:r>
+        <w:t>Betriebsrente als Transformationsinstrument</w:t>
+      </w:r>
+    </w:p>
+    <w:p>
+      <w:r>
+        <w:t>Dieser Abschnitt untersucht betriebsrente als transformationsinstrument im Zusammenhang mit Rente, sozialer Sicherung und positiver Netto-Wirkung. Er beschreibt, welche Informationen benötigt werden, welche Akteure betroffen sind, welche rechtlichen Grenzen bestehen und welche Gestaltungsspielräume politisch offen bleiben.</w:t>
+      </w:r>
+    </w:p>
+    <w:p>
+      <w:pPr>
+        <w:pStyle w:val="Heading3"/>
+      </w:pPr>
+      <w:r>
+        <w:t>Private Vorsorge ohne Greenwashing</w:t>
+      </w:r>
+    </w:p>
+    <w:p>
+      <w:r>
+        <w:t>Dieser Abschnitt untersucht private vorsorge ohne greenwashing im Zusammenhang mit Rente, sozialer Sicherung und positiver Netto-Wirkung. Er beschreibt, welche Informationen benötigt werden, welche Akteure betroffen sind, welche rechtlichen Grenzen bestehen und welche Gestaltungsspielräume politisch offen bleiben.</w:t>
+      </w:r>
+    </w:p>
+    <w:p>
+      <w:pPr>
+        <w:pStyle w:val="Heading3"/>
+      </w:pPr>
+      <w:r>
+        <w:t>Kapitalwirkung, ESG und WÖk-IDs</w:t>
+      </w:r>
+    </w:p>
+    <w:p>
+      <w:r>
+        <w:t>Dieser Abschnitt untersucht kapitalwirkung, esg und wök-ids im Zusammenhang mit Rente, sozialer Sicherung und positiver Netto-Wirkung. Er beschreibt, welche Informationen benötigt werden, welche Akteure betroffen sind, welche rechtlichen Grenzen bestehen und welche Gestaltungsspielräume politisch offen bleiben.</w:t>
+      </w:r>
+    </w:p>
+    <w:p>
+      <w:pPr>
+        <w:pStyle w:val="Heading3"/>
+      </w:pPr>
+      <w:r>
+        <w:t>Versicherbarkeit und Risiko-Wahrheit</w:t>
+      </w:r>
+    </w:p>
+    <w:p>
+      <w:r>
+        <w:t>Dieser Abschnitt untersucht versicherbarkeit und risiko-wahrheit im Zusammenhang mit Rente, sozialer Sicherung und positiver Netto-Wirkung. Er beschreibt, welche Informationen benötigt werden, welche Akteure betroffen sind, welche rechtlichen Grenzen bestehen und welche Gestaltungsspielräume politisch offen bleiben.</w:t>
+      </w:r>
+    </w:p>
+    <w:p>
+      <w:pPr>
+        <w:pStyle w:val="Heading3"/>
+      </w:pPr>
+      <w:r>
+        <w:t>Schutz für kleine Einkommen</w:t>
+      </w:r>
+    </w:p>
+    <w:p>
+      <w:r>
+        <w:t>Dieser Abschnitt untersucht schutz für kleine einkommen im Zusammenhang mit Rente, sozialer Sicherung und positiver Netto-Wirkung. Er beschreibt, welche Informationen benötigt werden, welche Akteure betroffen sind, welche rechtlichen Grenzen bestehen und welche Gestaltungsspielräume politisch offen bleiben.</w:t>
+      </w:r>
+    </w:p>
+    <w:p>
+      <w:pPr>
+        <w:pStyle w:val="Heading2"/>
+      </w:pPr>
+      <w:r>
+        <w:t>5. Daten, Indikatoren und WÖk-ID-Anschluss</w:t>
+      </w:r>
+    </w:p>
+    <w:p>
+      <w:r>
+        <w:t>Der Unterbereich benötigt eine Datenlogik, die aus bestehenden Quellen schöpft, aber nicht in Überwachung kippt. Mögliche Indikatorfamilien sind faire Arbeit und Einkommen, Sozialschutz, Care und Vereinbarkeit, Weiterbildung, Gesundheit, gesellschaftlicher Zusammenhalt, institutionelles Vertrauen, digitale Selbstbestimmung und Kapitalwirkung. WÖk-IDs dienen als Adresse der Wirkung, nicht als Personenetikett.</w:t>
+      </w:r>
+    </w:p>
+    <w:p>
+      <w:pPr>
+        <w:pStyle w:val="Heading2"/>
+      </w:pPr>
+      <w:r>
+        <w:t>6. Berechnungs- oder Bewertungslogik</w:t>
+      </w:r>
+    </w:p>
+    <w:p>
+      <w:r>
+        <w:t>Die Bewertungslogik ist modular: Zuerst wird die Würdeebene geschützt, danach werden klassische Ansprüche gesichert, erst dann werden Wirkungsboni oder Fondsanteile ergänzt. Bei unsicheren Daten gilt ein Vorsichtsprinzip. In der Pilotphase werden positive Wirkungen sichtbar gemacht, negative Systemwirkungen primär über Unternehmens-, Produkt-, Kapital- und Steuerinstrumente rückgekoppelt.</w:t>
+      </w:r>
+    </w:p>
+    <w:p>
+      <w:pPr>
+        <w:pStyle w:val="Heading2"/>
+      </w:pPr>
+      <w:r>
+        <w:t>7. Schutzlinien</w:t>
+      </w:r>
+    </w:p>
+    <w:p>
+      <w:pPr>
+        <w:pStyle w:val="ListBullet"/>
+      </w:pPr>
+      <w:r>
+        <w:t>Keine automatische Letztentscheidung.</w:t>
+      </w:r>
+    </w:p>
+    <w:p>
+      <w:pPr>
+        <w:pStyle w:val="ListBullet"/>
+      </w:pPr>
+      <w:r>
+        <w:t>Keine Absenkung unter die Würde- und Teilhabeebene.</w:t>
+      </w:r>
+    </w:p>
+    <w:p>
+      <w:pPr>
+        <w:pStyle w:val="ListBullet"/>
+      </w:pPr>
+      <w:r>
+        <w:t>Keine pauschale Bewertung von Personen nach Branchenzugehörigkeit.</w:t>
+      </w:r>
+    </w:p>
+    <w:p>
+      <w:pPr>
+        <w:pStyle w:val="ListBullet"/>
+      </w:pPr>
+      <w:r>
+        <w:t>Datensparsamkeit und Zweckbindung.</w:t>
+      </w:r>
+    </w:p>
+    <w:p>
+      <w:pPr>
+        <w:pStyle w:val="ListBullet"/>
+      </w:pPr>
+      <w:r>
+        <w:t>Recht auf Auskunft, Korrektur und Widerspruch.</w:t>
+      </w:r>
+    </w:p>
+    <w:p>
+      <w:pPr>
+        <w:pStyle w:val="ListBullet"/>
+      </w:pPr>
+      <w:r>
+        <w:t>Parlamentarische und gerichtliche Kontrolle.</w:t>
+      </w:r>
+    </w:p>
+    <w:p>
+      <w:pPr>
+        <w:pStyle w:val="Heading2"/>
+      </w:pPr>
+      <w:r>
+        <w:t>8. Politische Anschlussfähigkeit</w:t>
+      </w:r>
+    </w:p>
+    <w:p>
+      <w:r>
+        <w:t>Der Baustein ist politisch offen. Er kann konservativ als Anerkennung von Lebensleistung, sozialdemokratisch als soziale Sicherheit, liberal als Eigenverantwortung mit transparenten Anreizen, grün als Zukunftsinvestition, links als Schutz vor Altersarmut, kommunal als Teilhabeinstrument oder wirtschaftsnah als Resilienzfaktor interpretiert werden. Die Wirkungsökonomie gibt den Rahmen, nicht die parteipolitische Detailentscheidung vor.</w:t>
+      </w:r>
+    </w:p>
+    <w:p>
+      <w:pPr>
+        <w:pStyle w:val="Heading2"/>
+      </w:pPr>
+      <w:r>
+        <w:t>9. SDG-/SDG+-Bezug</w:t>
+      </w:r>
+    </w:p>
+    <w:p>
+      <w:r>
+        <w:t>SDG 8, SDG 10, SDG 12, SDG 16, SDG+ institutionelles Vertrauen</w:t>
       </w:r>
     </w:p>
     <w:p>
@@ -1356,7 +2271,7 @@
         <w:pStyle w:val="Heading1"/>
       </w:pPr>
       <w:r>
-        <w:t>5. Care, Bildung, Pflege, Ehrenamt und Wirkleistung</w:t>
+        <w:t>9. Rechtsschutz, Datenschutz und Korrekturverfahren</w:t>
       </w:r>
     </w:p>
     <w:p>
@@ -1369,7 +2284,7 @@
     </w:p>
     <w:p>
       <w:r>
-        <w:t>Dieses Detailkonzept beschreibt den Unterbereich "Care, Bildung, Pflege, Ehrenamt und Wirkleistung" als eigenständigen Baustein des Portals Rente &amp; soziale Sicherung. Es grenzt den Baustein von klassischen Rentenreformen ab und zeigt, wie er in die Wirkungsökonomie eingebettet wird.</w:t>
+        <w:t>Dieses Detailkonzept beschreibt den Unterbereich "Rechtsschutz, Datenschutz und Korrekturverfahren" als eigenständigen Baustein des Portals Rente &amp; soziale Sicherung. Es grenzt den Baustein von klassischen Rentenreformen ab und zeigt, wie er in die Wirkungsökonomie eingebettet wird.</w:t>
       </w:r>
     </w:p>
     <w:p>
@@ -1382,7 +2297,7 @@
     </w:p>
     <w:p>
       <w:r>
-        <w:t>Care, Bildung, Pflege, Ehrenamt, kulturelle Arbeit und demokratisches Engagement erzeugen Stabilität, werden aber oft schlechter bezahlt oder gar nicht entlohnt. Das erzeugt Rentenlücken und schwächt Vertrauen in das Leistungsprinzip.</w:t>
+        <w:t>Ein System, das Lebenswirkung sichtbar macht, kann Vertrauen nur gewinnen, wenn es klare Grenzen, Rechte, Korrekturwege und Schutz vor technokratischer Verengung hat.</w:t>
       </w:r>
     </w:p>
     <w:p>
@@ -1400,7 +2315,7 @@
     </w:p>
     <w:p>
       <w:r>
-        <w:t>Die Wirkungsrente erkennt nicht-marktliche und unterbewertete Wirkleistung als systemische Leistung an. Sie unterscheidet dabei zwischen echter Wirkleistung, bloßer Aktivität und symbolischer Behauptung.</w:t>
+        <w:t>Wirkungsdaten bereiten Entscheidungen vor, ersetzen sie aber nicht. Das Rentensystem braucht Transparenz, Datensparsamkeit, Einspruchsrechte, menschliche Prüfung und parlamentarische Kontrolle.</w:t>
       </w:r>
     </w:p>
     <w:p>
@@ -1421,12 +2336,12 @@
         <w:pStyle w:val="Heading3"/>
       </w:pPr>
       <w:r>
-        <w:t>Care als Infrastrukturleistung</w:t>
-      </w:r>
-    </w:p>
-    <w:p>
-      <w:r>
-        <w:t>Dieser Abschnitt untersucht care als infrastrukturleistung im Zusammenhang mit Rente, sozialer Sicherung und positiver Netto-Wirkung. Er beschreibt, welche Informationen benötigt werden, welche Akteure betroffen sind, welche rechtlichen Grenzen bestehen und welche Gestaltungsspielräume politisch offen bleiben.</w:t>
+        <w:t>Datensparsamkeit und Zweckbindung</w:t>
+      </w:r>
+    </w:p>
+    <w:p>
+      <w:r>
+        <w:t>Dieser Abschnitt untersucht datensparsamkeit und zweckbindung im Zusammenhang mit Rente, sozialer Sicherung und positiver Netto-Wirkung. Er beschreibt, welche Informationen benötigt werden, welche Akteure betroffen sind, welche rechtlichen Grenzen bestehen und welche Gestaltungsspielräume politisch offen bleiben.</w:t>
       </w:r>
     </w:p>
     <w:p>
@@ -1434,12 +2349,12 @@
         <w:pStyle w:val="Heading3"/>
       </w:pPr>
       <w:r>
-        <w:t>Bildung und Prävention als Zukunftswirkung</w:t>
-      </w:r>
-    </w:p>
-    <w:p>
-      <w:r>
-        <w:t>Dieser Abschnitt untersucht bildung und prävention als zukunftswirkung im Zusammenhang mit Rente, sozialer Sicherung und positiver Netto-Wirkung. Er beschreibt, welche Informationen benötigt werden, welche Akteure betroffen sind, welche rechtlichen Grenzen bestehen und welche Gestaltungsspielräume politisch offen bleiben.</w:t>
+        <w:t>Recht auf Auskunft und Korrektur</w:t>
+      </w:r>
+    </w:p>
+    <w:p>
+      <w:r>
+        <w:t>Dieser Abschnitt untersucht recht auf auskunft und korrektur im Zusammenhang mit Rente, sozialer Sicherung und positiver Netto-Wirkung. Er beschreibt, welche Informationen benötigt werden, welche Akteure betroffen sind, welche rechtlichen Grenzen bestehen und welche Gestaltungsspielräume politisch offen bleiben.</w:t>
       </w:r>
     </w:p>
     <w:p>
@@ -1447,12 +2362,12 @@
         <w:pStyle w:val="Heading3"/>
       </w:pPr>
       <w:r>
-        <w:t>Ehrenamt und Demokratiearbeit</w:t>
-      </w:r>
-    </w:p>
-    <w:p>
-      <w:r>
-        <w:t>Dieser Abschnitt untersucht ehrenamt und demokratiearbeit im Zusammenhang mit Rente, sozialer Sicherung und positiver Netto-Wirkung. Er beschreibt, welche Informationen benötigt werden, welche Akteure betroffen sind, welche rechtlichen Grenzen bestehen und welche Gestaltungsspielräume politisch offen bleiben.</w:t>
+        <w:t>Keine automatisierte Letztentscheidung</w:t>
+      </w:r>
+    </w:p>
+    <w:p>
+      <w:r>
+        <w:t>Dieser Abschnitt untersucht keine automatisierte letztentscheidung im Zusammenhang mit Rente, sozialer Sicherung und positiver Netto-Wirkung. Er beschreibt, welche Informationen benötigt werden, welche Akteure betroffen sind, welche rechtlichen Grenzen bestehen und welche Gestaltungsspielräume politisch offen bleiben.</w:t>
       </w:r>
     </w:p>
     <w:p>
@@ -1460,12 +2375,12 @@
         <w:pStyle w:val="Heading3"/>
       </w:pPr>
       <w:r>
-        <w:t>Nachweise ohne Bürokratiewut</w:t>
-      </w:r>
-    </w:p>
-    <w:p>
-      <w:r>
-        <w:t>Dieser Abschnitt untersucht nachweise ohne bürokratiewut im Zusammenhang mit Rente, sozialer Sicherung und positiver Netto-Wirkung. Er beschreibt, welche Informationen benötigt werden, welche Akteure betroffen sind, welche rechtlichen Grenzen bestehen und welche Gestaltungsspielräume politisch offen bleiben.</w:t>
+        <w:t>Schutz vulnerabler Gruppen</w:t>
+      </w:r>
+    </w:p>
+    <w:p>
+      <w:r>
+        <w:t>Dieser Abschnitt untersucht schutz vulnerabler gruppen im Zusammenhang mit Rente, sozialer Sicherung und positiver Netto-Wirkung. Er beschreibt, welche Informationen benötigt werden, welche Akteure betroffen sind, welche rechtlichen Grenzen bestehen und welche Gestaltungsspielräume politisch offen bleiben.</w:t>
       </w:r>
     </w:p>
     <w:p>
@@ -1473,12 +2388,12 @@
         <w:pStyle w:val="Heading3"/>
       </w:pPr>
       <w:r>
-        <w:t>Gender Pension Gap und Care-Gerechtigkeit</w:t>
-      </w:r>
-    </w:p>
-    <w:p>
-      <w:r>
-        <w:t>Dieser Abschnitt untersucht gender pension gap und care-gerechtigkeit im Zusammenhang mit Rente, sozialer Sicherung und positiver Netto-Wirkung. Er beschreibt, welche Informationen benötigt werden, welche Akteure betroffen sind, welche rechtlichen Grenzen bestehen und welche Gestaltungsspielräume politisch offen bleiben.</w:t>
+        <w:t>Demokratische Evaluation</w:t>
+      </w:r>
+    </w:p>
+    <w:p>
+      <w:r>
+        <w:t>Dieser Abschnitt untersucht demokratische evaluation im Zusammenhang mit Rente, sozialer Sicherung und positiver Netto-Wirkung. Er beschreibt, welche Informationen benötigt werden, welche Akteure betroffen sind, welche rechtlichen Grenzen bestehen und welche Gestaltungsspielräume politisch offen bleiben.</w:t>
       </w:r>
     </w:p>
     <w:p>
@@ -1586,7 +2501,20 @@
     </w:p>
     <w:p>
       <w:r>
-        <w:t>SDG 3, SDG 4, SDG 5, SDG 10, SDG 16, SDG+ Demokratie</w:t>
+        <w:t>SDG 10, SDG 16, SDG 17, SDG+ Rechtsstaatlichkeit, SDG+ digitale Selbstbestimmung</w:t>
+      </w:r>
+    </w:p>
+    <w:p>
+      <w:r>
+        <w:br w:type="page"/>
+      </w:r>
+    </w:p>
+    <w:p>
+      <w:pPr>
+        <w:pStyle w:val="Heading1"/>
+      </w:pPr>
+      <w:r>
+        <w:t>10. Politische Anschlussfähigkeit und Umsetzungsoptionen</w:t>
       </w:r>
     </w:p>
     <w:p>
@@ -1594,12 +2522,229 @@
         <w:pStyle w:val="Heading2"/>
       </w:pPr>
       <w:r>
-        <w:t>10. Online-Umsetzung</w:t>
-      </w:r>
-    </w:p>
-    <w:p>
-      <w:r>
-        <w:t>Dieses Detailkonzept sollte online unter /wirkungsfelder/rente-soziale-sicherung/care-bildung-ehrenamt/ veröffentlicht werden. Die Seite benötigt Inhaltsverzeichnis, Kapitelanker, Dossier-Download, Kontext-Werkzeuge, Buchanker, SDG-/SDG+-Referenzblock und Druckfunktion.</w:t>
+        <w:t>1. Zweck und Abgrenzung</w:t>
+      </w:r>
+    </w:p>
+    <w:p>
+      <w:r>
+        <w:t>Dieses Detailkonzept beschreibt den Unterbereich "Politische Anschlussfähigkeit und Umsetzungsoptionen" als eigenständigen Baustein des Portals Rente &amp; soziale Sicherung. Es grenzt den Baustein von klassischen Rentenreformen ab und zeigt, wie er in die Wirkungsökonomie eingebettet wird.</w:t>
+      </w:r>
+    </w:p>
+    <w:p>
+      <w:pPr>
+        <w:pStyle w:val="Heading2"/>
+      </w:pPr>
+      <w:r>
+        <w:t>2. Alte Logik und Problemstruktur</w:t>
+      </w:r>
+    </w:p>
+    <w:p>
+      <w:r>
+        <w:t>Rentenreformen scheitern oft, wenn sie als Nullsummenspiel zwischen Generationen, Parteien oder Einkommensgruppen erscheinen.</w:t>
+      </w:r>
+    </w:p>
+    <w:p>
+      <w:r>
+        <w:t>Die alte Logik behandelt Rente als nachgelagerte Auszahlung aus Erwerbs- und Beitragsbiografien. Das ist verwaltungstechnisch klar, aber wirkungsökonomisch unvollständig. Denn sie übersieht, ob eine Tätigkeit Folgekosten senkt, Vertrauen stärkt, Generationen verbindet, Pflege leistet oder Transformation ermöglicht. Ein wirkungsökonomisches Detailkonzept muss deshalb zwischen Einkommen, Beschäftigung, Leistung und Wirkung unterscheiden.</w:t>
+      </w:r>
+    </w:p>
+    <w:p>
+      <w:pPr>
+        <w:pStyle w:val="Heading2"/>
+      </w:pPr>
+      <w:r>
+        <w:t>3. Wirkungsökonomischer Perspektivwechsel</w:t>
+      </w:r>
+    </w:p>
+    <w:p>
+      <w:r>
+        <w:t>Die Wirkungsrente formuliert einen Rahmen, aber keinen fertigen Parteibeschluss. Parteien können unterschiedliche Wege wählen: stärker umlageorientiert, stärker fondsorientiert, stärker kommunal, stärker marktwirtschaftlich oder stärker sozialstaatlich - solange Wirkung sichtbar, überprüfbar und korrigierbar bleibt.</w:t>
+      </w:r>
+    </w:p>
+    <w:p>
+      <w:r>
+        <w:t>Wirkungsökonomisch wird nicht gefragt, ob eine Person "mehr wert" ist. Gefragt wird, welche Zustände durch Lebensleistung, Institutionen und Systeme verbessert oder verschlechtert werden und wie ein soziales Sicherungssystem diese Wirklichkeit fairer abbilden kann. Dabei bleibt der Schutz vor Personenbewertung zentral.</w:t>
+      </w:r>
+    </w:p>
+    <w:p>
+      <w:pPr>
+        <w:pStyle w:val="Heading2"/>
+      </w:pPr>
+      <w:r>
+        <w:t>4. Unterkapitel und Struktur</w:t>
+      </w:r>
+    </w:p>
+    <w:p>
+      <w:pPr>
+        <w:pStyle w:val="Heading3"/>
+      </w:pPr>
+      <w:r>
+        <w:t>Parteipolitischer Ausgestaltungsspielraum</w:t>
+      </w:r>
+    </w:p>
+    <w:p>
+      <w:r>
+        <w:t>Dieser Abschnitt untersucht parteipolitischer ausgestaltungsspielraum im Zusammenhang mit Rente, sozialer Sicherung und positiver Netto-Wirkung. Er beschreibt, welche Informationen benötigt werden, welche Akteure betroffen sind, welche rechtlichen Grenzen bestehen und welche Gestaltungsspielräume politisch offen bleiben.</w:t>
+      </w:r>
+    </w:p>
+    <w:p>
+      <w:pPr>
+        <w:pStyle w:val="Heading3"/>
+      </w:pPr>
+      <w:r>
+        <w:t>Pilotierung und Revisionszyklen</w:t>
+      </w:r>
+    </w:p>
+    <w:p>
+      <w:r>
+        <w:t>Dieser Abschnitt untersucht pilotierung und revisionszyklen im Zusammenhang mit Rente, sozialer Sicherung und positiver Netto-Wirkung. Er beschreibt, welche Informationen benötigt werden, welche Akteure betroffen sind, welche rechtlichen Grenzen bestehen und welche Gestaltungsspielräume politisch offen bleiben.</w:t>
+      </w:r>
+    </w:p>
+    <w:p>
+      <w:pPr>
+        <w:pStyle w:val="Heading3"/>
+      </w:pPr>
+      <w:r>
+        <w:t>Bund, Länder, Kommunen, EU</w:t>
+      </w:r>
+    </w:p>
+    <w:p>
+      <w:r>
+        <w:t>Dieser Abschnitt untersucht bund, länder, kommunen, eu im Zusammenhang mit Rente, sozialer Sicherung und positiver Netto-Wirkung. Er beschreibt, welche Informationen benötigt werden, welche Akteure betroffen sind, welche rechtlichen Grenzen bestehen und welche Gestaltungsspielräume politisch offen bleiben.</w:t>
+      </w:r>
+    </w:p>
+    <w:p>
+      <w:pPr>
+        <w:pStyle w:val="Heading3"/>
+      </w:pPr>
+      <w:r>
+        <w:t>Sozialer Schutz im Übergang</w:t>
+      </w:r>
+    </w:p>
+    <w:p>
+      <w:r>
+        <w:t>Dieser Abschnitt untersucht sozialer schutz im übergang im Zusammenhang mit Rente, sozialer Sicherung und positiver Netto-Wirkung. Er beschreibt, welche Informationen benötigt werden, welche Akteure betroffen sind, welche rechtlichen Grenzen bestehen und welche Gestaltungsspielräume politisch offen bleiben.</w:t>
+      </w:r>
+    </w:p>
+    <w:p>
+      <w:pPr>
+        <w:pStyle w:val="Heading3"/>
+      </w:pPr>
+      <w:r>
+        <w:t>Evaluation und demokratische Korrektur</w:t>
+      </w:r>
+    </w:p>
+    <w:p>
+      <w:r>
+        <w:t>Dieser Abschnitt untersucht evaluation und demokratische korrektur im Zusammenhang mit Rente, sozialer Sicherung und positiver Netto-Wirkung. Er beschreibt, welche Informationen benötigt werden, welche Akteure betroffen sind, welche rechtlichen Grenzen bestehen und welche Gestaltungsspielräume politisch offen bleiben.</w:t>
+      </w:r>
+    </w:p>
+    <w:p>
+      <w:pPr>
+        <w:pStyle w:val="Heading2"/>
+      </w:pPr>
+      <w:r>
+        <w:t>5. Daten, Indikatoren und WÖk-ID-Anschluss</w:t>
+      </w:r>
+    </w:p>
+    <w:p>
+      <w:r>
+        <w:t>Der Unterbereich benötigt eine Datenlogik, die aus bestehenden Quellen schöpft, aber nicht in Überwachung kippt. Mögliche Indikatorfamilien sind faire Arbeit und Einkommen, Sozialschutz, Care und Vereinbarkeit, Weiterbildung, Gesundheit, gesellschaftlicher Zusammenhalt, institutionelles Vertrauen, digitale Selbstbestimmung und Kapitalwirkung. WÖk-IDs dienen als Adresse der Wirkung, nicht als Personenetikett.</w:t>
+      </w:r>
+    </w:p>
+    <w:p>
+      <w:pPr>
+        <w:pStyle w:val="Heading2"/>
+      </w:pPr>
+      <w:r>
+        <w:t>6. Berechnungs- oder Bewertungslogik</w:t>
+      </w:r>
+    </w:p>
+    <w:p>
+      <w:r>
+        <w:t>Die Bewertungslogik ist modular: Zuerst wird die Würdeebene geschützt, danach werden klassische Ansprüche gesichert, erst dann werden Wirkungsboni oder Fondsanteile ergänzt. Bei unsicheren Daten gilt ein Vorsichtsprinzip. In der Pilotphase werden positive Wirkungen sichtbar gemacht, negative Systemwirkungen primär über Unternehmens-, Produkt-, Kapital- und Steuerinstrumente rückgekoppelt.</w:t>
+      </w:r>
+    </w:p>
+    <w:p>
+      <w:pPr>
+        <w:pStyle w:val="Heading2"/>
+      </w:pPr>
+      <w:r>
+        <w:t>7. Schutzlinien</w:t>
+      </w:r>
+    </w:p>
+    <w:p>
+      <w:pPr>
+        <w:pStyle w:val="ListBullet"/>
+      </w:pPr>
+      <w:r>
+        <w:t>Keine automatische Letztentscheidung.</w:t>
+      </w:r>
+    </w:p>
+    <w:p>
+      <w:pPr>
+        <w:pStyle w:val="ListBullet"/>
+      </w:pPr>
+      <w:r>
+        <w:t>Keine Absenkung unter die Würde- und Teilhabeebene.</w:t>
+      </w:r>
+    </w:p>
+    <w:p>
+      <w:pPr>
+        <w:pStyle w:val="ListBullet"/>
+      </w:pPr>
+      <w:r>
+        <w:t>Keine pauschale Bewertung von Personen nach Branchenzugehörigkeit.</w:t>
+      </w:r>
+    </w:p>
+    <w:p>
+      <w:pPr>
+        <w:pStyle w:val="ListBullet"/>
+      </w:pPr>
+      <w:r>
+        <w:t>Datensparsamkeit und Zweckbindung.</w:t>
+      </w:r>
+    </w:p>
+    <w:p>
+      <w:pPr>
+        <w:pStyle w:val="ListBullet"/>
+      </w:pPr>
+      <w:r>
+        <w:t>Recht auf Auskunft, Korrektur und Widerspruch.</w:t>
+      </w:r>
+    </w:p>
+    <w:p>
+      <w:pPr>
+        <w:pStyle w:val="ListBullet"/>
+      </w:pPr>
+      <w:r>
+        <w:t>Parlamentarische und gerichtliche Kontrolle.</w:t>
+      </w:r>
+    </w:p>
+    <w:p>
+      <w:pPr>
+        <w:pStyle w:val="Heading2"/>
+      </w:pPr>
+      <w:r>
+        <w:t>8. Politische Anschlussfähigkeit</w:t>
+      </w:r>
+    </w:p>
+    <w:p>
+      <w:r>
+        <w:t>Der Baustein ist politisch offen. Er kann konservativ als Anerkennung von Lebensleistung, sozialdemokratisch als soziale Sicherheit, liberal als Eigenverantwortung mit transparenten Anreizen, grün als Zukunftsinvestition, links als Schutz vor Altersarmut, kommunal als Teilhabeinstrument oder wirtschaftsnah als Resilienzfaktor interpretiert werden. Die Wirkungsökonomie gibt den Rahmen, nicht die parteipolitische Detailentscheidung vor.</w:t>
+      </w:r>
+    </w:p>
+    <w:p>
+      <w:pPr>
+        <w:pStyle w:val="Heading2"/>
+      </w:pPr>
+      <w:r>
+        <w:t>9. SDG-/SDG+-Bezug</w:t>
+      </w:r>
+    </w:p>
+    <w:p>
+      <w:r>
+        <w:t>SDG 16, SDG 17, SDG+ Demokratie, SDG+ Diskursfähigkeit</w:t>
       </w:r>
     </w:p>
     <w:p>
@@ -1612,1292 +2757,12 @@
         <w:pStyle w:val="Heading1"/>
       </w:pPr>
       <w:r>
-        <w:t>6. Automatisierung, Sozialabgaben-Entkopplung und Wirkungsdividende</w:t>
-      </w:r>
-    </w:p>
-    <w:p>
-      <w:pPr>
-        <w:pStyle w:val="Heading2"/>
-      </w:pPr>
-      <w:r>
-        <w:t>1. Zweck und Abgrenzung</w:t>
-      </w:r>
-    </w:p>
-    <w:p>
-      <w:r>
-        <w:t>Dieses Detailkonzept beschreibt den Unterbereich "Automatisierung, Sozialabgaben-Entkopplung und Wirkungsdividende" als eigenständigen Baustein des Portals Rente &amp; soziale Sicherung. Es grenzt den Baustein von klassischen Rentenreformen ab und zeigt, wie er in die Wirkungsökonomie eingebettet wird.</w:t>
-      </w:r>
-    </w:p>
-    <w:p>
-      <w:pPr>
-        <w:pStyle w:val="Heading2"/>
-      </w:pPr>
-      <w:r>
-        <w:t>2. Alte Logik und Problemstruktur</w:t>
-      </w:r>
-    </w:p>
-    <w:p>
-      <w:r>
-        <w:t>Wenn Maschinen, KI und Plattformen mehr produktive Arbeit übernehmen, bricht die Kette Arbeit - Einkommen - Sozialabgaben - Rentenfinanzierung. Eine Ordnung, die soziale Sicherung an menschliche Lohnarbeit bindet, wird dadurch instabil.</w:t>
-      </w:r>
-    </w:p>
-    <w:p>
-      <w:r>
-        <w:t>Die alte Logik behandelt Rente als nachgelagerte Auszahlung aus Erwerbs- und Beitragsbiografien. Das ist verwaltungstechnisch klar, aber wirkungsökonomisch unvollständig. Denn sie übersieht, ob eine Tätigkeit Folgekosten senkt, Vertrauen stärkt, Generationen verbindet, Pflege leistet oder Transformation ermöglicht. Ein wirkungsökonomisches Detailkonzept muss deshalb zwischen Einkommen, Beschäftigung, Leistung und Wirkung unterscheiden.</w:t>
-      </w:r>
-    </w:p>
-    <w:p>
-      <w:pPr>
-        <w:pStyle w:val="Heading2"/>
-      </w:pPr>
-      <w:r>
-        <w:t>3. Wirkungsökonomischer Perspektivwechsel</w:t>
-      </w:r>
-    </w:p>
-    <w:p>
-      <w:r>
-        <w:t>Die Wirkungsökonomie entkoppelt die Finanzierungsbasis sozialer Sicherung schrittweise von menschlicher Arbeitsleistung. Automatisierte Wertschöpfung wird nicht bestraft, sondern gesellschaftlich rückgekoppelt: in Wirkungsfonds, Wirkungsdividende und sozial stabile Übergänge.</w:t>
-      </w:r>
-    </w:p>
-    <w:p>
-      <w:r>
-        <w:t>Wirkungsökonomisch wird nicht gefragt, ob eine Person "mehr wert" ist. Gefragt wird, welche Zustände durch Lebensleistung, Institutionen und Systeme verbessert oder verschlechtert werden und wie ein soziales Sicherungssystem diese Wirklichkeit fairer abbilden kann. Dabei bleibt der Schutz vor Personenbewertung zentral.</w:t>
-      </w:r>
-    </w:p>
-    <w:p>
-      <w:pPr>
-        <w:pStyle w:val="Heading2"/>
-      </w:pPr>
-      <w:r>
-        <w:t>4. Unterkapitel und Struktur</w:t>
-      </w:r>
-    </w:p>
-    <w:p>
-      <w:pPr>
-        <w:pStyle w:val="Heading3"/>
-      </w:pPr>
-      <w:r>
-        <w:t>Warum Robotersteuer allein zu kurz greift</w:t>
-      </w:r>
-    </w:p>
-    <w:p>
-      <w:r>
-        <w:t>Dieser Abschnitt untersucht warum robotersteuer allein zu kurz greift im Zusammenhang mit Rente, sozialer Sicherung und positiver Netto-Wirkung. Er beschreibt, welche Informationen benötigt werden, welche Akteure betroffen sind, welche rechtlichen Grenzen bestehen und welche Gestaltungsspielräume politisch offen bleiben.</w:t>
-      </w:r>
-    </w:p>
-    <w:p>
-      <w:pPr>
-        <w:pStyle w:val="Heading3"/>
-      </w:pPr>
-      <w:r>
-        <w:t>Maschinenleistung als Wertschöpfungsquelle</w:t>
-      </w:r>
-    </w:p>
-    <w:p>
-      <w:r>
-        <w:t>Dieser Abschnitt untersucht maschinenleistung als wertschöpfungsquelle im Zusammenhang mit Rente, sozialer Sicherung und positiver Netto-Wirkung. Er beschreibt, welche Informationen benötigt werden, welche Akteure betroffen sind, welche rechtlichen Grenzen bestehen und welche Gestaltungsspielräume politisch offen bleiben.</w:t>
-      </w:r>
-    </w:p>
-    <w:p>
-      <w:pPr>
-        <w:pStyle w:val="Heading3"/>
-      </w:pPr>
-      <w:r>
-        <w:t>Sozialabgaben-Entkopplung</w:t>
-      </w:r>
-    </w:p>
-    <w:p>
-      <w:r>
-        <w:t>Dieser Abschnitt untersucht sozialabgaben-entkopplung im Zusammenhang mit Rente, sozialer Sicherung und positiver Netto-Wirkung. Er beschreibt, welche Informationen benötigt werden, welche Akteure betroffen sind, welche rechtlichen Grenzen bestehen und welche Gestaltungsspielräume politisch offen bleiben.</w:t>
-      </w:r>
-    </w:p>
-    <w:p>
-      <w:pPr>
-        <w:pStyle w:val="Heading3"/>
-      </w:pPr>
-      <w:r>
-        <w:t>Wirkungsdividende als systemischer Anspruch</w:t>
-      </w:r>
-    </w:p>
-    <w:p>
-      <w:r>
-        <w:t>Dieser Abschnitt untersucht wirkungsdividende als systemischer anspruch im Zusammenhang mit Rente, sozialer Sicherung und positiver Netto-Wirkung. Er beschreibt, welche Informationen benötigt werden, welche Akteure betroffen sind, welche rechtlichen Grenzen bestehen und welche Gestaltungsspielräume politisch offen bleiben.</w:t>
-      </w:r>
-    </w:p>
-    <w:p>
-      <w:pPr>
-        <w:pStyle w:val="Heading3"/>
-      </w:pPr>
-      <w:r>
-        <w:t>Übergänge für Unternehmen und Beschäftigte</w:t>
-      </w:r>
-    </w:p>
-    <w:p>
-      <w:r>
-        <w:t>Dieser Abschnitt untersucht übergänge für unternehmen und beschäftigte im Zusammenhang mit Rente, sozialer Sicherung und positiver Netto-Wirkung. Er beschreibt, welche Informationen benötigt werden, welche Akteure betroffen sind, welche rechtlichen Grenzen bestehen und welche Gestaltungsspielräume politisch offen bleiben.</w:t>
-      </w:r>
-    </w:p>
-    <w:p>
-      <w:pPr>
-        <w:pStyle w:val="Heading2"/>
-      </w:pPr>
-      <w:r>
-        <w:t>5. Daten, Indikatoren und WÖk-ID-Anschluss</w:t>
-      </w:r>
-    </w:p>
-    <w:p>
-      <w:r>
-        <w:t>Der Unterbereich benötigt eine Datenlogik, die aus bestehenden Quellen schöpft, aber nicht in Überwachung kippt. Mögliche Indikatorfamilien sind faire Arbeit und Einkommen, Sozialschutz, Care und Vereinbarkeit, Weiterbildung, Gesundheit, gesellschaftlicher Zusammenhalt, institutionelles Vertrauen, digitale Selbstbestimmung und Kapitalwirkung. WÖk-IDs dienen als Adresse der Wirkung, nicht als Personenetikett.</w:t>
-      </w:r>
-    </w:p>
-    <w:p>
-      <w:pPr>
-        <w:pStyle w:val="Heading2"/>
-      </w:pPr>
-      <w:r>
-        <w:t>6. Berechnungs- oder Bewertungslogik</w:t>
-      </w:r>
-    </w:p>
-    <w:p>
-      <w:r>
-        <w:t>Die Bewertungslogik ist modular: Zuerst wird die Würdeebene geschützt, danach werden klassische Ansprüche gesichert, erst dann werden Wirkungsboni oder Fondsanteile ergänzt. Bei unsicheren Daten gilt ein Vorsichtsprinzip. In der Pilotphase werden positive Wirkungen sichtbar gemacht, negative Systemwirkungen primär über Unternehmens-, Produkt-, Kapital- und Steuerinstrumente rückgekoppelt.</w:t>
-      </w:r>
-    </w:p>
-    <w:p>
-      <w:pPr>
-        <w:pStyle w:val="Heading2"/>
-      </w:pPr>
-      <w:r>
-        <w:t>7. Schutzlinien</w:t>
-      </w:r>
-    </w:p>
-    <w:p>
-      <w:pPr>
-        <w:pStyle w:val="ListBullet"/>
-      </w:pPr>
-      <w:r>
-        <w:t>Keine automatische Letztentscheidung.</w:t>
-      </w:r>
-    </w:p>
-    <w:p>
-      <w:pPr>
-        <w:pStyle w:val="ListBullet"/>
-      </w:pPr>
-      <w:r>
-        <w:t>Keine Absenkung unter die Würde- und Teilhabeebene.</w:t>
-      </w:r>
-    </w:p>
-    <w:p>
-      <w:pPr>
-        <w:pStyle w:val="ListBullet"/>
-      </w:pPr>
-      <w:r>
-        <w:t>Keine pauschale Bewertung von Personen nach Branchenzugehörigkeit.</w:t>
-      </w:r>
-    </w:p>
-    <w:p>
-      <w:pPr>
-        <w:pStyle w:val="ListBullet"/>
-      </w:pPr>
-      <w:r>
-        <w:t>Datensparsamkeit und Zweckbindung.</w:t>
-      </w:r>
-    </w:p>
-    <w:p>
-      <w:pPr>
-        <w:pStyle w:val="ListBullet"/>
-      </w:pPr>
-      <w:r>
-        <w:t>Recht auf Auskunft, Korrektur und Widerspruch.</w:t>
-      </w:r>
-    </w:p>
-    <w:p>
-      <w:pPr>
-        <w:pStyle w:val="ListBullet"/>
-      </w:pPr>
-      <w:r>
-        <w:t>Parlamentarische und gerichtliche Kontrolle.</w:t>
-      </w:r>
-    </w:p>
-    <w:p>
-      <w:pPr>
-        <w:pStyle w:val="Heading2"/>
-      </w:pPr>
-      <w:r>
-        <w:t>8. Politische Anschlussfähigkeit</w:t>
-      </w:r>
-    </w:p>
-    <w:p>
-      <w:r>
-        <w:t>Der Baustein ist politisch offen. Er kann konservativ als Anerkennung von Lebensleistung, sozialdemokratisch als soziale Sicherheit, liberal als Eigenverantwortung mit transparenten Anreizen, grün als Zukunftsinvestition, links als Schutz vor Altersarmut, kommunal als Teilhabeinstrument oder wirtschaftsnah als Resilienzfaktor interpretiert werden. Die Wirkungsökonomie gibt den Rahmen, nicht die parteipolitische Detailentscheidung vor.</w:t>
-      </w:r>
-    </w:p>
-    <w:p>
-      <w:pPr>
-        <w:pStyle w:val="Heading2"/>
-      </w:pPr>
-      <w:r>
-        <w:t>9. SDG-/SDG+-Bezug</w:t>
-      </w:r>
-    </w:p>
-    <w:p>
-      <w:r>
-        <w:t>SDG 8, SDG 9, SDG 10, SDG 16, SDG+ institutionelles Vertrauen</w:t>
-      </w:r>
-    </w:p>
-    <w:p>
-      <w:pPr>
-        <w:pStyle w:val="Heading2"/>
-      </w:pPr>
-      <w:r>
-        <w:t>10. Online-Umsetzung</w:t>
-      </w:r>
-    </w:p>
-    <w:p>
-      <w:r>
-        <w:t>Dieses Detailkonzept sollte online unter /wirkungsfelder/rente-soziale-sicherung/automatisierung-sozialabgaben/ veröffentlicht werden. Die Seite benötigt Inhaltsverzeichnis, Kapitelanker, Dossier-Download, Kontext-Werkzeuge, Buchanker, SDG-/SDG+-Referenzblock und Druckfunktion.</w:t>
-      </w:r>
-    </w:p>
-    <w:p>
-      <w:r>
-        <w:br w:type="page"/>
-      </w:r>
-    </w:p>
-    <w:p>
-      <w:pPr>
-        <w:pStyle w:val="Heading1"/>
-      </w:pPr>
-      <w:r>
-        <w:t>7. Renten-Impact-Fonds und Wirkungsfondsarchitektur</w:t>
-      </w:r>
-    </w:p>
-    <w:p>
-      <w:pPr>
-        <w:pStyle w:val="Heading2"/>
-      </w:pPr>
-      <w:r>
-        <w:t>1. Zweck und Abgrenzung</w:t>
-      </w:r>
-    </w:p>
-    <w:p>
-      <w:r>
-        <w:t>Dieses Detailkonzept beschreibt den Unterbereich "Renten-Impact-Fonds und Wirkungsfondsarchitektur" als eigenständigen Baustein des Portals Rente &amp; soziale Sicherung. Es grenzt den Baustein von klassischen Rentenreformen ab und zeigt, wie er in die Wirkungsökonomie eingebettet wird.</w:t>
-      </w:r>
-    </w:p>
-    <w:p>
-      <w:pPr>
-        <w:pStyle w:val="Heading2"/>
-      </w:pPr>
-      <w:r>
-        <w:t>2. Alte Logik und Problemstruktur</w:t>
-      </w:r>
-    </w:p>
-    <w:p>
-      <w:r>
-        <w:t>Kapitalgedeckte Altersvorsorge kann alte Fehler wiederholen, wenn sie Rendite aus zerstörerischen Geschäftsmodellen bezieht. Dann finanziert Altersvorsorge die Risiken, die künftige Generationen tragen müssen.</w:t>
-      </w:r>
-    </w:p>
-    <w:p>
-      <w:r>
-        <w:t>Die alte Logik behandelt Rente als nachgelagerte Auszahlung aus Erwerbs- und Beitragsbiografien. Das ist verwaltungstechnisch klar, aber wirkungsökonomisch unvollständig. Denn sie übersieht, ob eine Tätigkeit Folgekosten senkt, Vertrauen stärkt, Generationen verbindet, Pflege leistet oder Transformation ermöglicht. Ein wirkungsökonomisches Detailkonzept muss deshalb zwischen Einkommen, Beschäftigung, Leistung und Wirkung unterscheiden.</w:t>
-      </w:r>
-    </w:p>
-    <w:p>
-      <w:pPr>
-        <w:pStyle w:val="Heading2"/>
-      </w:pPr>
-      <w:r>
-        <w:t>3. Wirkungsökonomischer Perspektivwechsel</w:t>
-      </w:r>
-    </w:p>
-    <w:p>
-      <w:r>
-        <w:t>Wirkungsfonds investieren Kapital nach positiver Netto-Wirkung. Der Renten-Impact-Fonds wird nicht als Spekulationsinstrument verstanden, sondern als Transformations- und Stabilitätsinstrument für Bildung, Gesundheit, Wohnen, Klima, Pflege, Demokratie und Infrastruktur.</w:t>
-      </w:r>
-    </w:p>
-    <w:p>
-      <w:r>
-        <w:t>Wirkungsökonomisch wird nicht gefragt, ob eine Person "mehr wert" ist. Gefragt wird, welche Zustände durch Lebensleistung, Institutionen und Systeme verbessert oder verschlechtert werden und wie ein soziales Sicherungssystem diese Wirklichkeit fairer abbilden kann. Dabei bleibt der Schutz vor Personenbewertung zentral.</w:t>
-      </w:r>
-    </w:p>
-    <w:p>
-      <w:pPr>
-        <w:pStyle w:val="Heading2"/>
-      </w:pPr>
-      <w:r>
-        <w:t>4. Unterkapitel und Struktur</w:t>
-      </w:r>
-    </w:p>
-    <w:p>
-      <w:pPr>
-        <w:pStyle w:val="Heading3"/>
-      </w:pPr>
-      <w:r>
-        <w:t>Kapital als Werkzeug, nicht Ziel</w:t>
-      </w:r>
-    </w:p>
-    <w:p>
-      <w:r>
-        <w:t>Dieser Abschnitt untersucht kapital als werkzeug, nicht ziel im Zusammenhang mit Rente, sozialer Sicherung und positiver Netto-Wirkung. Er beschreibt, welche Informationen benötigt werden, welche Akteure betroffen sind, welche rechtlichen Grenzen bestehen und welche Gestaltungsspielräume politisch offen bleiben.</w:t>
-      </w:r>
-    </w:p>
-    <w:p>
-      <w:pPr>
-        <w:pStyle w:val="Heading3"/>
-      </w:pPr>
-      <w:r>
-        <w:t>Fondsquellen und Mittelverwendung</w:t>
-      </w:r>
-    </w:p>
-    <w:p>
-      <w:r>
-        <w:t>Dieser Abschnitt untersucht fondsquellen und mittelverwendung im Zusammenhang mit Rente, sozialer Sicherung und positiver Netto-Wirkung. Er beschreibt, welche Informationen benötigt werden, welche Akteure betroffen sind, welche rechtlichen Grenzen bestehen und welche Gestaltungsspielräume politisch offen bleiben.</w:t>
-      </w:r>
-    </w:p>
-    <w:p>
-      <w:pPr>
-        <w:pStyle w:val="Heading3"/>
-      </w:pPr>
-      <w:r>
-        <w:t>Investitionskriterien und Ausschlüsse</w:t>
-      </w:r>
-    </w:p>
-    <w:p>
-      <w:r>
-        <w:t>Dieser Abschnitt untersucht investitionskriterien und ausschlüsse im Zusammenhang mit Rente, sozialer Sicherung und positiver Netto-Wirkung. Er beschreibt, welche Informationen benötigt werden, welche Akteure betroffen sind, welche rechtlichen Grenzen bestehen und welche Gestaltungsspielräume politisch offen bleiben.</w:t>
-      </w:r>
-    </w:p>
-    <w:p>
-      <w:pPr>
-        <w:pStyle w:val="Heading3"/>
-      </w:pPr>
-      <w:r>
-        <w:t>Rendite als Folge positiver Wirkung</w:t>
-      </w:r>
-    </w:p>
-    <w:p>
-      <w:r>
-        <w:t>Dieser Abschnitt untersucht rendite als folge positiver wirkung im Zusammenhang mit Rente, sozialer Sicherung und positiver Netto-Wirkung. Er beschreibt, welche Informationen benötigt werden, welche Akteure betroffen sind, welche rechtlichen Grenzen bestehen und welche Gestaltungsspielräume politisch offen bleiben.</w:t>
-      </w:r>
-    </w:p>
-    <w:p>
-      <w:pPr>
-        <w:pStyle w:val="Heading3"/>
-      </w:pPr>
-      <w:r>
-        <w:t>Governance und Wirkungsrat</w:t>
-      </w:r>
-    </w:p>
-    <w:p>
-      <w:r>
-        <w:t>Dieser Abschnitt untersucht governance und wirkungsrat im Zusammenhang mit Rente, sozialer Sicherung und positiver Netto-Wirkung. Er beschreibt, welche Informationen benötigt werden, welche Akteure betroffen sind, welche rechtlichen Grenzen bestehen und welche Gestaltungsspielräume politisch offen bleiben.</w:t>
-      </w:r>
-    </w:p>
-    <w:p>
-      <w:pPr>
-        <w:pStyle w:val="Heading2"/>
-      </w:pPr>
-      <w:r>
-        <w:t>5. Daten, Indikatoren und WÖk-ID-Anschluss</w:t>
-      </w:r>
-    </w:p>
-    <w:p>
-      <w:r>
-        <w:t>Der Unterbereich benötigt eine Datenlogik, die aus bestehenden Quellen schöpft, aber nicht in Überwachung kippt. Mögliche Indikatorfamilien sind faire Arbeit und Einkommen, Sozialschutz, Care und Vereinbarkeit, Weiterbildung, Gesundheit, gesellschaftlicher Zusammenhalt, institutionelles Vertrauen, digitale Selbstbestimmung und Kapitalwirkung. WÖk-IDs dienen als Adresse der Wirkung, nicht als Personenetikett.</w:t>
-      </w:r>
-    </w:p>
-    <w:p>
-      <w:pPr>
-        <w:pStyle w:val="Heading2"/>
-      </w:pPr>
-      <w:r>
-        <w:t>6. Berechnungs- oder Bewertungslogik</w:t>
-      </w:r>
-    </w:p>
-    <w:p>
-      <w:r>
-        <w:t>Die Bewertungslogik ist modular: Zuerst wird die Würdeebene geschützt, danach werden klassische Ansprüche gesichert, erst dann werden Wirkungsboni oder Fondsanteile ergänzt. Bei unsicheren Daten gilt ein Vorsichtsprinzip. In der Pilotphase werden positive Wirkungen sichtbar gemacht, negative Systemwirkungen primär über Unternehmens-, Produkt-, Kapital- und Steuerinstrumente rückgekoppelt.</w:t>
-      </w:r>
-    </w:p>
-    <w:p>
-      <w:pPr>
-        <w:pStyle w:val="Heading2"/>
-      </w:pPr>
-      <w:r>
-        <w:t>7. Schutzlinien</w:t>
-      </w:r>
-    </w:p>
-    <w:p>
-      <w:pPr>
-        <w:pStyle w:val="ListBullet"/>
-      </w:pPr>
-      <w:r>
-        <w:t>Keine automatische Letztentscheidung.</w:t>
-      </w:r>
-    </w:p>
-    <w:p>
-      <w:pPr>
-        <w:pStyle w:val="ListBullet"/>
-      </w:pPr>
-      <w:r>
-        <w:t>Keine Absenkung unter die Würde- und Teilhabeebene.</w:t>
-      </w:r>
-    </w:p>
-    <w:p>
-      <w:pPr>
-        <w:pStyle w:val="ListBullet"/>
-      </w:pPr>
-      <w:r>
-        <w:t>Keine pauschale Bewertung von Personen nach Branchenzugehörigkeit.</w:t>
-      </w:r>
-    </w:p>
-    <w:p>
-      <w:pPr>
-        <w:pStyle w:val="ListBullet"/>
-      </w:pPr>
-      <w:r>
-        <w:t>Datensparsamkeit und Zweckbindung.</w:t>
-      </w:r>
-    </w:p>
-    <w:p>
-      <w:pPr>
-        <w:pStyle w:val="ListBullet"/>
-      </w:pPr>
-      <w:r>
-        <w:t>Recht auf Auskunft, Korrektur und Widerspruch.</w:t>
-      </w:r>
-    </w:p>
-    <w:p>
-      <w:pPr>
-        <w:pStyle w:val="ListBullet"/>
-      </w:pPr>
-      <w:r>
-        <w:t>Parlamentarische und gerichtliche Kontrolle.</w:t>
-      </w:r>
-    </w:p>
-    <w:p>
-      <w:pPr>
-        <w:pStyle w:val="Heading2"/>
-      </w:pPr>
-      <w:r>
-        <w:t>8. Politische Anschlussfähigkeit</w:t>
-      </w:r>
-    </w:p>
-    <w:p>
-      <w:r>
-        <w:t>Der Baustein ist politisch offen. Er kann konservativ als Anerkennung von Lebensleistung, sozialdemokratisch als soziale Sicherheit, liberal als Eigenverantwortung mit transparenten Anreizen, grün als Zukunftsinvestition, links als Schutz vor Altersarmut, kommunal als Teilhabeinstrument oder wirtschaftsnah als Resilienzfaktor interpretiert werden. Die Wirkungsökonomie gibt den Rahmen, nicht die parteipolitische Detailentscheidung vor.</w:t>
-      </w:r>
-    </w:p>
-    <w:p>
-      <w:pPr>
-        <w:pStyle w:val="Heading2"/>
-      </w:pPr>
-      <w:r>
-        <w:t>9. SDG-/SDG+-Bezug</w:t>
-      </w:r>
-    </w:p>
-    <w:p>
-      <w:r>
-        <w:t>SDG 1, SDG 3, SDG 9, SDG 10, SDG 11, SDG 13, SDG 16, SDG 17</w:t>
-      </w:r>
-    </w:p>
-    <w:p>
-      <w:pPr>
-        <w:pStyle w:val="Heading2"/>
-      </w:pPr>
-      <w:r>
-        <w:t>10. Online-Umsetzung</w:t>
-      </w:r>
-    </w:p>
-    <w:p>
-      <w:r>
-        <w:t>Dieses Detailkonzept sollte online unter /wirkungsfelder/rente-soziale-sicherung/renten-impact-fonds/ veröffentlicht werden. Die Seite benötigt Inhaltsverzeichnis, Kapitelanker, Dossier-Download, Kontext-Werkzeuge, Buchanker, SDG-/SDG+-Referenzblock und Druckfunktion.</w:t>
-      </w:r>
-    </w:p>
-    <w:p>
-      <w:r>
-        <w:br w:type="page"/>
-      </w:r>
-    </w:p>
-    <w:p>
-      <w:pPr>
-        <w:pStyle w:val="Heading1"/>
-      </w:pPr>
-      <w:r>
-        <w:t>8. Betriebliche und private Vorsorge nach Wirkung</w:t>
-      </w:r>
-    </w:p>
-    <w:p>
-      <w:pPr>
-        <w:pStyle w:val="Heading2"/>
-      </w:pPr>
-      <w:r>
-        <w:t>1. Zweck und Abgrenzung</w:t>
-      </w:r>
-    </w:p>
-    <w:p>
-      <w:r>
-        <w:t>Dieses Detailkonzept beschreibt den Unterbereich "Betriebliche und private Vorsorge nach Wirkung" als eigenständigen Baustein des Portals Rente &amp; soziale Sicherung. Es grenzt den Baustein von klassischen Rentenreformen ab und zeigt, wie er in die Wirkungsökonomie eingebettet wird.</w:t>
-      </w:r>
-    </w:p>
-    <w:p>
-      <w:pPr>
-        <w:pStyle w:val="Heading2"/>
-      </w:pPr>
-      <w:r>
-        <w:t>2. Alte Logik und Problemstruktur</w:t>
-      </w:r>
-    </w:p>
-    <w:p>
-      <w:r>
-        <w:t>Betriebliche und private Vorsorge können individuelle Sicherheit stärken, aber auch Wirkungslücken erzeugen, wenn Kapitalanlagen nach Rendite ohne Wirkungswahrheit gesteuert werden.</w:t>
-      </w:r>
-    </w:p>
-    <w:p>
-      <w:r>
-        <w:t>Die alte Logik behandelt Rente als nachgelagerte Auszahlung aus Erwerbs- und Beitragsbiografien. Das ist verwaltungstechnisch klar, aber wirkungsökonomisch unvollständig. Denn sie übersieht, ob eine Tätigkeit Folgekosten senkt, Vertrauen stärkt, Generationen verbindet, Pflege leistet oder Transformation ermöglicht. Ein wirkungsökonomisches Detailkonzept muss deshalb zwischen Einkommen, Beschäftigung, Leistung und Wirkung unterscheiden.</w:t>
-      </w:r>
-    </w:p>
-    <w:p>
-      <w:pPr>
-        <w:pStyle w:val="Heading2"/>
-      </w:pPr>
-      <w:r>
-        <w:t>3. Wirkungsökonomischer Perspektivwechsel</w:t>
-      </w:r>
-    </w:p>
-    <w:p>
-      <w:r>
-        <w:t>Die Wirkungsökonomie ordnet betriebliche und private Vorsorge nicht ab, sondern richtet sie neu aus: Transparente Kapitalwirkung, faire Kosten, soziale Zugänglichkeit und Resilienz werden zu Qualitätskriterien.</w:t>
-      </w:r>
-    </w:p>
-    <w:p>
-      <w:r>
-        <w:t>Wirkungsökonomisch wird nicht gefragt, ob eine Person "mehr wert" ist. Gefragt wird, welche Zustände durch Lebensleistung, Institutionen und Systeme verbessert oder verschlechtert werden und wie ein soziales Sicherungssystem diese Wirklichkeit fairer abbilden kann. Dabei bleibt der Schutz vor Personenbewertung zentral.</w:t>
-      </w:r>
-    </w:p>
-    <w:p>
-      <w:pPr>
-        <w:pStyle w:val="Heading2"/>
-      </w:pPr>
-      <w:r>
-        <w:t>4. Unterkapitel und Struktur</w:t>
-      </w:r>
-    </w:p>
-    <w:p>
-      <w:pPr>
-        <w:pStyle w:val="Heading3"/>
-      </w:pPr>
-      <w:r>
-        <w:t>Betriebsrente als Transformationsinstrument</w:t>
-      </w:r>
-    </w:p>
-    <w:p>
-      <w:r>
-        <w:t>Dieser Abschnitt untersucht betriebsrente als transformationsinstrument im Zusammenhang mit Rente, sozialer Sicherung und positiver Netto-Wirkung. Er beschreibt, welche Informationen benötigt werden, welche Akteure betroffen sind, welche rechtlichen Grenzen bestehen und welche Gestaltungsspielräume politisch offen bleiben.</w:t>
-      </w:r>
-    </w:p>
-    <w:p>
-      <w:pPr>
-        <w:pStyle w:val="Heading3"/>
-      </w:pPr>
-      <w:r>
-        <w:t>Private Vorsorge ohne Greenwashing</w:t>
-      </w:r>
-    </w:p>
-    <w:p>
-      <w:r>
-        <w:t>Dieser Abschnitt untersucht private vorsorge ohne greenwashing im Zusammenhang mit Rente, sozialer Sicherung und positiver Netto-Wirkung. Er beschreibt, welche Informationen benötigt werden, welche Akteure betroffen sind, welche rechtlichen Grenzen bestehen und welche Gestaltungsspielräume politisch offen bleiben.</w:t>
-      </w:r>
-    </w:p>
-    <w:p>
-      <w:pPr>
-        <w:pStyle w:val="Heading3"/>
-      </w:pPr>
-      <w:r>
-        <w:t>Kapitalwirkung, ESG und WÖk-IDs</w:t>
-      </w:r>
-    </w:p>
-    <w:p>
-      <w:r>
-        <w:t>Dieser Abschnitt untersucht kapitalwirkung, esg und wök-ids im Zusammenhang mit Rente, sozialer Sicherung und positiver Netto-Wirkung. Er beschreibt, welche Informationen benötigt werden, welche Akteure betroffen sind, welche rechtlichen Grenzen bestehen und welche Gestaltungsspielräume politisch offen bleiben.</w:t>
-      </w:r>
-    </w:p>
-    <w:p>
-      <w:pPr>
-        <w:pStyle w:val="Heading3"/>
-      </w:pPr>
-      <w:r>
-        <w:t>Versicherbarkeit und Risiko-Wahrheit</w:t>
-      </w:r>
-    </w:p>
-    <w:p>
-      <w:r>
-        <w:t>Dieser Abschnitt untersucht versicherbarkeit und risiko-wahrheit im Zusammenhang mit Rente, sozialer Sicherung und positiver Netto-Wirkung. Er beschreibt, welche Informationen benötigt werden, welche Akteure betroffen sind, welche rechtlichen Grenzen bestehen und welche Gestaltungsspielräume politisch offen bleiben.</w:t>
-      </w:r>
-    </w:p>
-    <w:p>
-      <w:pPr>
-        <w:pStyle w:val="Heading3"/>
-      </w:pPr>
-      <w:r>
-        <w:t>Schutz für kleine Einkommen</w:t>
-      </w:r>
-    </w:p>
-    <w:p>
-      <w:r>
-        <w:t>Dieser Abschnitt untersucht schutz für kleine einkommen im Zusammenhang mit Rente, sozialer Sicherung und positiver Netto-Wirkung. Er beschreibt, welche Informationen benötigt werden, welche Akteure betroffen sind, welche rechtlichen Grenzen bestehen und welche Gestaltungsspielräume politisch offen bleiben.</w:t>
-      </w:r>
-    </w:p>
-    <w:p>
-      <w:pPr>
-        <w:pStyle w:val="Heading2"/>
-      </w:pPr>
-      <w:r>
-        <w:t>5. Daten, Indikatoren und WÖk-ID-Anschluss</w:t>
-      </w:r>
-    </w:p>
-    <w:p>
-      <w:r>
-        <w:t>Der Unterbereich benötigt eine Datenlogik, die aus bestehenden Quellen schöpft, aber nicht in Überwachung kippt. Mögliche Indikatorfamilien sind faire Arbeit und Einkommen, Sozialschutz, Care und Vereinbarkeit, Weiterbildung, Gesundheit, gesellschaftlicher Zusammenhalt, institutionelles Vertrauen, digitale Selbstbestimmung und Kapitalwirkung. WÖk-IDs dienen als Adresse der Wirkung, nicht als Personenetikett.</w:t>
-      </w:r>
-    </w:p>
-    <w:p>
-      <w:pPr>
-        <w:pStyle w:val="Heading2"/>
-      </w:pPr>
-      <w:r>
-        <w:t>6. Berechnungs- oder Bewertungslogik</w:t>
-      </w:r>
-    </w:p>
-    <w:p>
-      <w:r>
-        <w:t>Die Bewertungslogik ist modular: Zuerst wird die Würdeebene geschützt, danach werden klassische Ansprüche gesichert, erst dann werden Wirkungsboni oder Fondsanteile ergänzt. Bei unsicheren Daten gilt ein Vorsichtsprinzip. In der Pilotphase werden positive Wirkungen sichtbar gemacht, negative Systemwirkungen primär über Unternehmens-, Produkt-, Kapital- und Steuerinstrumente rückgekoppelt.</w:t>
-      </w:r>
-    </w:p>
-    <w:p>
-      <w:pPr>
-        <w:pStyle w:val="Heading2"/>
-      </w:pPr>
-      <w:r>
-        <w:t>7. Schutzlinien</w:t>
-      </w:r>
-    </w:p>
-    <w:p>
-      <w:pPr>
-        <w:pStyle w:val="ListBullet"/>
-      </w:pPr>
-      <w:r>
-        <w:t>Keine automatische Letztentscheidung.</w:t>
-      </w:r>
-    </w:p>
-    <w:p>
-      <w:pPr>
-        <w:pStyle w:val="ListBullet"/>
-      </w:pPr>
-      <w:r>
-        <w:t>Keine Absenkung unter die Würde- und Teilhabeebene.</w:t>
-      </w:r>
-    </w:p>
-    <w:p>
-      <w:pPr>
-        <w:pStyle w:val="ListBullet"/>
-      </w:pPr>
-      <w:r>
-        <w:t>Keine pauschale Bewertung von Personen nach Branchenzugehörigkeit.</w:t>
-      </w:r>
-    </w:p>
-    <w:p>
-      <w:pPr>
-        <w:pStyle w:val="ListBullet"/>
-      </w:pPr>
-      <w:r>
-        <w:t>Datensparsamkeit und Zweckbindung.</w:t>
-      </w:r>
-    </w:p>
-    <w:p>
-      <w:pPr>
-        <w:pStyle w:val="ListBullet"/>
-      </w:pPr>
-      <w:r>
-        <w:t>Recht auf Auskunft, Korrektur und Widerspruch.</w:t>
-      </w:r>
-    </w:p>
-    <w:p>
-      <w:pPr>
-        <w:pStyle w:val="ListBullet"/>
-      </w:pPr>
-      <w:r>
-        <w:t>Parlamentarische und gerichtliche Kontrolle.</w:t>
-      </w:r>
-    </w:p>
-    <w:p>
-      <w:pPr>
-        <w:pStyle w:val="Heading2"/>
-      </w:pPr>
-      <w:r>
-        <w:t>8. Politische Anschlussfähigkeit</w:t>
-      </w:r>
-    </w:p>
-    <w:p>
-      <w:r>
-        <w:t>Der Baustein ist politisch offen. Er kann konservativ als Anerkennung von Lebensleistung, sozialdemokratisch als soziale Sicherheit, liberal als Eigenverantwortung mit transparenten Anreizen, grün als Zukunftsinvestition, links als Schutz vor Altersarmut, kommunal als Teilhabeinstrument oder wirtschaftsnah als Resilienzfaktor interpretiert werden. Die Wirkungsökonomie gibt den Rahmen, nicht die parteipolitische Detailentscheidung vor.</w:t>
-      </w:r>
-    </w:p>
-    <w:p>
-      <w:pPr>
-        <w:pStyle w:val="Heading2"/>
-      </w:pPr>
-      <w:r>
-        <w:t>9. SDG-/SDG+-Bezug</w:t>
-      </w:r>
-    </w:p>
-    <w:p>
-      <w:r>
-        <w:t>SDG 8, SDG 10, SDG 12, SDG 16, SDG+ institutionelles Vertrauen</w:t>
-      </w:r>
-    </w:p>
-    <w:p>
-      <w:pPr>
-        <w:pStyle w:val="Heading2"/>
-      </w:pPr>
-      <w:r>
-        <w:t>10. Online-Umsetzung</w:t>
-      </w:r>
-    </w:p>
-    <w:p>
-      <w:r>
-        <w:t>Dieses Detailkonzept sollte online unter /wirkungsfelder/rente-soziale-sicherung/betriebliche-private-vorsorge/ veröffentlicht werden. Die Seite benötigt Inhaltsverzeichnis, Kapitelanker, Dossier-Download, Kontext-Werkzeuge, Buchanker, SDG-/SDG+-Referenzblock und Druckfunktion.</w:t>
-      </w:r>
-    </w:p>
-    <w:p>
-      <w:r>
-        <w:br w:type="page"/>
-      </w:r>
-    </w:p>
-    <w:p>
-      <w:pPr>
-        <w:pStyle w:val="Heading1"/>
-      </w:pPr>
-      <w:r>
-        <w:t>9. Rechtsschutz, Datenschutz und Korrekturverfahren</w:t>
-      </w:r>
-    </w:p>
-    <w:p>
-      <w:pPr>
-        <w:pStyle w:val="Heading2"/>
-      </w:pPr>
-      <w:r>
-        <w:t>1. Zweck und Abgrenzung</w:t>
-      </w:r>
-    </w:p>
-    <w:p>
-      <w:r>
-        <w:t>Dieses Detailkonzept beschreibt den Unterbereich "Rechtsschutz, Datenschutz und Korrekturverfahren" als eigenständigen Baustein des Portals Rente &amp; soziale Sicherung. Es grenzt den Baustein von klassischen Rentenreformen ab und zeigt, wie er in die Wirkungsökonomie eingebettet wird.</w:t>
-      </w:r>
-    </w:p>
-    <w:p>
-      <w:pPr>
-        <w:pStyle w:val="Heading2"/>
-      </w:pPr>
-      <w:r>
-        <w:t>2. Alte Logik und Problemstruktur</w:t>
-      </w:r>
-    </w:p>
-    <w:p>
-      <w:r>
-        <w:t>Ein System, das Lebenswirkung sichtbar macht, kann Vertrauen nur gewinnen, wenn es klare Grenzen, Rechte, Korrekturwege und Schutz vor technokratischer Verengung hat.</w:t>
-      </w:r>
-    </w:p>
-    <w:p>
-      <w:r>
-        <w:t>Die alte Logik behandelt Rente als nachgelagerte Auszahlung aus Erwerbs- und Beitragsbiografien. Das ist verwaltungstechnisch klar, aber wirkungsökonomisch unvollständig. Denn sie übersieht, ob eine Tätigkeit Folgekosten senkt, Vertrauen stärkt, Generationen verbindet, Pflege leistet oder Transformation ermöglicht. Ein wirkungsökonomisches Detailkonzept muss deshalb zwischen Einkommen, Beschäftigung, Leistung und Wirkung unterscheiden.</w:t>
-      </w:r>
-    </w:p>
-    <w:p>
-      <w:pPr>
-        <w:pStyle w:val="Heading2"/>
-      </w:pPr>
-      <w:r>
-        <w:t>3. Wirkungsökonomischer Perspektivwechsel</w:t>
-      </w:r>
-    </w:p>
-    <w:p>
-      <w:r>
-        <w:t>Wirkungsdaten bereiten Entscheidungen vor, ersetzen sie aber nicht. Das Rentensystem braucht Transparenz, Datensparsamkeit, Einspruchsrechte, menschliche Prüfung und parlamentarische Kontrolle.</w:t>
-      </w:r>
-    </w:p>
-    <w:p>
-      <w:r>
-        <w:t>Wirkungsökonomisch wird nicht gefragt, ob eine Person "mehr wert" ist. Gefragt wird, welche Zustände durch Lebensleistung, Institutionen und Systeme verbessert oder verschlechtert werden und wie ein soziales Sicherungssystem diese Wirklichkeit fairer abbilden kann. Dabei bleibt der Schutz vor Personenbewertung zentral.</w:t>
-      </w:r>
-    </w:p>
-    <w:p>
-      <w:pPr>
-        <w:pStyle w:val="Heading2"/>
-      </w:pPr>
-      <w:r>
-        <w:t>4. Unterkapitel und Struktur</w:t>
-      </w:r>
-    </w:p>
-    <w:p>
-      <w:pPr>
-        <w:pStyle w:val="Heading3"/>
-      </w:pPr>
-      <w:r>
-        <w:t>Datensparsamkeit und Zweckbindung</w:t>
-      </w:r>
-    </w:p>
-    <w:p>
-      <w:r>
-        <w:t>Dieser Abschnitt untersucht datensparsamkeit und zweckbindung im Zusammenhang mit Rente, sozialer Sicherung und positiver Netto-Wirkung. Er beschreibt, welche Informationen benötigt werden, welche Akteure betroffen sind, welche rechtlichen Grenzen bestehen und welche Gestaltungsspielräume politisch offen bleiben.</w:t>
-      </w:r>
-    </w:p>
-    <w:p>
-      <w:pPr>
-        <w:pStyle w:val="Heading3"/>
-      </w:pPr>
-      <w:r>
-        <w:t>Recht auf Auskunft und Korrektur</w:t>
-      </w:r>
-    </w:p>
-    <w:p>
-      <w:r>
-        <w:t>Dieser Abschnitt untersucht recht auf auskunft und korrektur im Zusammenhang mit Rente, sozialer Sicherung und positiver Netto-Wirkung. Er beschreibt, welche Informationen benötigt werden, welche Akteure betroffen sind, welche rechtlichen Grenzen bestehen und welche Gestaltungsspielräume politisch offen bleiben.</w:t>
-      </w:r>
-    </w:p>
-    <w:p>
-      <w:pPr>
-        <w:pStyle w:val="Heading3"/>
-      </w:pPr>
-      <w:r>
-        <w:t>Keine automatisierte Letztentscheidung</w:t>
-      </w:r>
-    </w:p>
-    <w:p>
-      <w:r>
-        <w:t>Dieser Abschnitt untersucht keine automatisierte letztentscheidung im Zusammenhang mit Rente, sozialer Sicherung und positiver Netto-Wirkung. Er beschreibt, welche Informationen benötigt werden, welche Akteure betroffen sind, welche rechtlichen Grenzen bestehen und welche Gestaltungsspielräume politisch offen bleiben.</w:t>
-      </w:r>
-    </w:p>
-    <w:p>
-      <w:pPr>
-        <w:pStyle w:val="Heading3"/>
-      </w:pPr>
-      <w:r>
-        <w:t>Schutz vulnerabler Gruppen</w:t>
-      </w:r>
-    </w:p>
-    <w:p>
-      <w:r>
-        <w:t>Dieser Abschnitt untersucht schutz vulnerabler gruppen im Zusammenhang mit Rente, sozialer Sicherung und positiver Netto-Wirkung. Er beschreibt, welche Informationen benötigt werden, welche Akteure betroffen sind, welche rechtlichen Grenzen bestehen und welche Gestaltungsspielräume politisch offen bleiben.</w:t>
-      </w:r>
-    </w:p>
-    <w:p>
-      <w:pPr>
-        <w:pStyle w:val="Heading3"/>
-      </w:pPr>
-      <w:r>
-        <w:t>Demokratische Evaluation</w:t>
-      </w:r>
-    </w:p>
-    <w:p>
-      <w:r>
-        <w:t>Dieser Abschnitt untersucht demokratische evaluation im Zusammenhang mit Rente, sozialer Sicherung und positiver Netto-Wirkung. Er beschreibt, welche Informationen benötigt werden, welche Akteure betroffen sind, welche rechtlichen Grenzen bestehen und welche Gestaltungsspielräume politisch offen bleiben.</w:t>
-      </w:r>
-    </w:p>
-    <w:p>
-      <w:pPr>
-        <w:pStyle w:val="Heading2"/>
-      </w:pPr>
-      <w:r>
-        <w:t>5. Daten, Indikatoren und WÖk-ID-Anschluss</w:t>
-      </w:r>
-    </w:p>
-    <w:p>
-      <w:r>
-        <w:t>Der Unterbereich benötigt eine Datenlogik, die aus bestehenden Quellen schöpft, aber nicht in Überwachung kippt. Mögliche Indikatorfamilien sind faire Arbeit und Einkommen, Sozialschutz, Care und Vereinbarkeit, Weiterbildung, Gesundheit, gesellschaftlicher Zusammenhalt, institutionelles Vertrauen, digitale Selbstbestimmung und Kapitalwirkung. WÖk-IDs dienen als Adresse der Wirkung, nicht als Personenetikett.</w:t>
-      </w:r>
-    </w:p>
-    <w:p>
-      <w:pPr>
-        <w:pStyle w:val="Heading2"/>
-      </w:pPr>
-      <w:r>
-        <w:t>6. Berechnungs- oder Bewertungslogik</w:t>
-      </w:r>
-    </w:p>
-    <w:p>
-      <w:r>
-        <w:t>Die Bewertungslogik ist modular: Zuerst wird die Würdeebene geschützt, danach werden klassische Ansprüche gesichert, erst dann werden Wirkungsboni oder Fondsanteile ergänzt. Bei unsicheren Daten gilt ein Vorsichtsprinzip. In der Pilotphase werden positive Wirkungen sichtbar gemacht, negative Systemwirkungen primär über Unternehmens-, Produkt-, Kapital- und Steuerinstrumente rückgekoppelt.</w:t>
-      </w:r>
-    </w:p>
-    <w:p>
-      <w:pPr>
-        <w:pStyle w:val="Heading2"/>
-      </w:pPr>
-      <w:r>
-        <w:t>7. Schutzlinien</w:t>
-      </w:r>
-    </w:p>
-    <w:p>
-      <w:pPr>
-        <w:pStyle w:val="ListBullet"/>
-      </w:pPr>
-      <w:r>
-        <w:t>Keine automatische Letztentscheidung.</w:t>
-      </w:r>
-    </w:p>
-    <w:p>
-      <w:pPr>
-        <w:pStyle w:val="ListBullet"/>
-      </w:pPr>
-      <w:r>
-        <w:t>Keine Absenkung unter die Würde- und Teilhabeebene.</w:t>
-      </w:r>
-    </w:p>
-    <w:p>
-      <w:pPr>
-        <w:pStyle w:val="ListBullet"/>
-      </w:pPr>
-      <w:r>
-        <w:t>Keine pauschale Bewertung von Personen nach Branchenzugehörigkeit.</w:t>
-      </w:r>
-    </w:p>
-    <w:p>
-      <w:pPr>
-        <w:pStyle w:val="ListBullet"/>
-      </w:pPr>
-      <w:r>
-        <w:t>Datensparsamkeit und Zweckbindung.</w:t>
-      </w:r>
-    </w:p>
-    <w:p>
-      <w:pPr>
-        <w:pStyle w:val="ListBullet"/>
-      </w:pPr>
-      <w:r>
-        <w:t>Recht auf Auskunft, Korrektur und Widerspruch.</w:t>
-      </w:r>
-    </w:p>
-    <w:p>
-      <w:pPr>
-        <w:pStyle w:val="ListBullet"/>
-      </w:pPr>
-      <w:r>
-        <w:t>Parlamentarische und gerichtliche Kontrolle.</w:t>
-      </w:r>
-    </w:p>
-    <w:p>
-      <w:pPr>
-        <w:pStyle w:val="Heading2"/>
-      </w:pPr>
-      <w:r>
-        <w:t>8. Politische Anschlussfähigkeit</w:t>
-      </w:r>
-    </w:p>
-    <w:p>
-      <w:r>
-        <w:t>Der Baustein ist politisch offen. Er kann konservativ als Anerkennung von Lebensleistung, sozialdemokratisch als soziale Sicherheit, liberal als Eigenverantwortung mit transparenten Anreizen, grün als Zukunftsinvestition, links als Schutz vor Altersarmut, kommunal als Teilhabeinstrument oder wirtschaftsnah als Resilienzfaktor interpretiert werden. Die Wirkungsökonomie gibt den Rahmen, nicht die parteipolitische Detailentscheidung vor.</w:t>
-      </w:r>
-    </w:p>
-    <w:p>
-      <w:pPr>
-        <w:pStyle w:val="Heading2"/>
-      </w:pPr>
-      <w:r>
-        <w:t>9. SDG-/SDG+-Bezug</w:t>
-      </w:r>
-    </w:p>
-    <w:p>
-      <w:r>
-        <w:t>SDG 10, SDG 16, SDG 17, SDG+ Rechtsstaatlichkeit, SDG+ digitale Selbstbestimmung</w:t>
-      </w:r>
-    </w:p>
-    <w:p>
-      <w:pPr>
-        <w:pStyle w:val="Heading2"/>
-      </w:pPr>
-      <w:r>
-        <w:t>10. Online-Umsetzung</w:t>
-      </w:r>
-    </w:p>
-    <w:p>
-      <w:r>
-        <w:t>Dieses Detailkonzept sollte online unter /wirkungsfelder/rente-soziale-sicherung/recht-datenschutz-korrektur/ veröffentlicht werden. Die Seite benötigt Inhaltsverzeichnis, Kapitelanker, Dossier-Download, Kontext-Werkzeuge, Buchanker, SDG-/SDG+-Referenzblock und Druckfunktion.</w:t>
-      </w:r>
-    </w:p>
-    <w:p>
-      <w:r>
-        <w:br w:type="page"/>
-      </w:r>
-    </w:p>
-    <w:p>
-      <w:pPr>
-        <w:pStyle w:val="Heading1"/>
-      </w:pPr>
-      <w:r>
-        <w:t>10. Politische Anschlussfähigkeit und Umsetzungsoptionen</w:t>
-      </w:r>
-    </w:p>
-    <w:p>
-      <w:pPr>
-        <w:pStyle w:val="Heading2"/>
-      </w:pPr>
-      <w:r>
-        <w:t>1. Zweck und Abgrenzung</w:t>
-      </w:r>
-    </w:p>
-    <w:p>
-      <w:r>
-        <w:t>Dieses Detailkonzept beschreibt den Unterbereich "Politische Anschlussfähigkeit und Umsetzungsoptionen" als eigenständigen Baustein des Portals Rente &amp; soziale Sicherung. Es grenzt den Baustein von klassischen Rentenreformen ab und zeigt, wie er in die Wirkungsökonomie eingebettet wird.</w:t>
-      </w:r>
-    </w:p>
-    <w:p>
-      <w:pPr>
-        <w:pStyle w:val="Heading2"/>
-      </w:pPr>
-      <w:r>
-        <w:t>2. Alte Logik und Problemstruktur</w:t>
-      </w:r>
-    </w:p>
-    <w:p>
-      <w:r>
-        <w:t>Rentenreformen scheitern oft, wenn sie als Nullsummenspiel zwischen Generationen, Parteien oder Einkommensgruppen erscheinen.</w:t>
-      </w:r>
-    </w:p>
-    <w:p>
-      <w:r>
-        <w:t>Die alte Logik behandelt Rente als nachgelagerte Auszahlung aus Erwerbs- und Beitragsbiografien. Das ist verwaltungstechnisch klar, aber wirkungsökonomisch unvollständig. Denn sie übersieht, ob eine Tätigkeit Folgekosten senkt, Vertrauen stärkt, Generationen verbindet, Pflege leistet oder Transformation ermöglicht. Ein wirkungsökonomisches Detailkonzept muss deshalb zwischen Einkommen, Beschäftigung, Leistung und Wirkung unterscheiden.</w:t>
-      </w:r>
-    </w:p>
-    <w:p>
-      <w:pPr>
-        <w:pStyle w:val="Heading2"/>
-      </w:pPr>
-      <w:r>
-        <w:t>3. Wirkungsökonomischer Perspektivwechsel</w:t>
-      </w:r>
-    </w:p>
-    <w:p>
-      <w:r>
-        <w:t>Die Wirkungsrente formuliert einen Rahmen, aber keinen fertigen Parteibeschluss. Parteien können unterschiedliche Wege wählen: stärker umlageorientiert, stärker fondsorientiert, stärker kommunal, stärker marktwirtschaftlich oder stärker sozialstaatlich - solange Wirkung sichtbar, überprüfbar und korrigierbar bleibt.</w:t>
-      </w:r>
-    </w:p>
-    <w:p>
-      <w:r>
-        <w:t>Wirkungsökonomisch wird nicht gefragt, ob eine Person "mehr wert" ist. Gefragt wird, welche Zustände durch Lebensleistung, Institutionen und Systeme verbessert oder verschlechtert werden und wie ein soziales Sicherungssystem diese Wirklichkeit fairer abbilden kann. Dabei bleibt der Schutz vor Personenbewertung zentral.</w:t>
-      </w:r>
-    </w:p>
-    <w:p>
-      <w:pPr>
-        <w:pStyle w:val="Heading2"/>
-      </w:pPr>
-      <w:r>
-        <w:t>4. Unterkapitel und Struktur</w:t>
-      </w:r>
-    </w:p>
-    <w:p>
-      <w:pPr>
-        <w:pStyle w:val="Heading3"/>
-      </w:pPr>
-      <w:r>
-        <w:t>Parteipolitischer Ausgestaltungsspielraum</w:t>
-      </w:r>
-    </w:p>
-    <w:p>
-      <w:r>
-        <w:t>Dieser Abschnitt untersucht parteipolitischer ausgestaltungsspielraum im Zusammenhang mit Rente, sozialer Sicherung und positiver Netto-Wirkung. Er beschreibt, welche Informationen benötigt werden, welche Akteure betroffen sind, welche rechtlichen Grenzen bestehen und welche Gestaltungsspielräume politisch offen bleiben.</w:t>
-      </w:r>
-    </w:p>
-    <w:p>
-      <w:pPr>
-        <w:pStyle w:val="Heading3"/>
-      </w:pPr>
-      <w:r>
-        <w:t>Pilotierung und Revisionszyklen</w:t>
-      </w:r>
-    </w:p>
-    <w:p>
-      <w:r>
-        <w:t>Dieser Abschnitt untersucht pilotierung und revisionszyklen im Zusammenhang mit Rente, sozialer Sicherung und positiver Netto-Wirkung. Er beschreibt, welche Informationen benötigt werden, welche Akteure betroffen sind, welche rechtlichen Grenzen bestehen und welche Gestaltungsspielräume politisch offen bleiben.</w:t>
-      </w:r>
-    </w:p>
-    <w:p>
-      <w:pPr>
-        <w:pStyle w:val="Heading3"/>
-      </w:pPr>
-      <w:r>
-        <w:t>Bund, Länder, Kommunen, EU</w:t>
-      </w:r>
-    </w:p>
-    <w:p>
-      <w:r>
-        <w:t>Dieser Abschnitt untersucht bund, länder, kommunen, eu im Zusammenhang mit Rente, sozialer Sicherung und positiver Netto-Wirkung. Er beschreibt, welche Informationen benötigt werden, welche Akteure betroffen sind, welche rechtlichen Grenzen bestehen und welche Gestaltungsspielräume politisch offen bleiben.</w:t>
-      </w:r>
-    </w:p>
-    <w:p>
-      <w:pPr>
-        <w:pStyle w:val="Heading3"/>
-      </w:pPr>
-      <w:r>
-        <w:t>Sozialer Schutz im Übergang</w:t>
-      </w:r>
-    </w:p>
-    <w:p>
-      <w:r>
-        <w:t>Dieser Abschnitt untersucht sozialer schutz im übergang im Zusammenhang mit Rente, sozialer Sicherung und positiver Netto-Wirkung. Er beschreibt, welche Informationen benötigt werden, welche Akteure betroffen sind, welche rechtlichen Grenzen bestehen und welche Gestaltungsspielräume politisch offen bleiben.</w:t>
-      </w:r>
-    </w:p>
-    <w:p>
-      <w:pPr>
-        <w:pStyle w:val="Heading3"/>
-      </w:pPr>
-      <w:r>
-        <w:t>Evaluation und demokratische Korrektur</w:t>
-      </w:r>
-    </w:p>
-    <w:p>
-      <w:r>
-        <w:t>Dieser Abschnitt untersucht evaluation und demokratische korrektur im Zusammenhang mit Rente, sozialer Sicherung und positiver Netto-Wirkung. Er beschreibt, welche Informationen benötigt werden, welche Akteure betroffen sind, welche rechtlichen Grenzen bestehen und welche Gestaltungsspielräume politisch offen bleiben.</w:t>
-      </w:r>
-    </w:p>
-    <w:p>
-      <w:pPr>
-        <w:pStyle w:val="Heading2"/>
-      </w:pPr>
-      <w:r>
-        <w:t>5. Daten, Indikatoren und WÖk-ID-Anschluss</w:t>
-      </w:r>
-    </w:p>
-    <w:p>
-      <w:r>
-        <w:t>Der Unterbereich benötigt eine Datenlogik, die aus bestehenden Quellen schöpft, aber nicht in Überwachung kippt. Mögliche Indikatorfamilien sind faire Arbeit und Einkommen, Sozialschutz, Care und Vereinbarkeit, Weiterbildung, Gesundheit, gesellschaftlicher Zusammenhalt, institutionelles Vertrauen, digitale Selbstbestimmung und Kapitalwirkung. WÖk-IDs dienen als Adresse der Wirkung, nicht als Personenetikett.</w:t>
-      </w:r>
-    </w:p>
-    <w:p>
-      <w:pPr>
-        <w:pStyle w:val="Heading2"/>
-      </w:pPr>
-      <w:r>
-        <w:t>6. Berechnungs- oder Bewertungslogik</w:t>
-      </w:r>
-    </w:p>
-    <w:p>
-      <w:r>
-        <w:t>Die Bewertungslogik ist modular: Zuerst wird die Würdeebene geschützt, danach werden klassische Ansprüche gesichert, erst dann werden Wirkungsboni oder Fondsanteile ergänzt. Bei unsicheren Daten gilt ein Vorsichtsprinzip. In der Pilotphase werden positive Wirkungen sichtbar gemacht, negative Systemwirkungen primär über Unternehmens-, Produkt-, Kapital- und Steuerinstrumente rückgekoppelt.</w:t>
-      </w:r>
-    </w:p>
-    <w:p>
-      <w:pPr>
-        <w:pStyle w:val="Heading2"/>
-      </w:pPr>
-      <w:r>
-        <w:t>7. Schutzlinien</w:t>
-      </w:r>
-    </w:p>
-    <w:p>
-      <w:pPr>
-        <w:pStyle w:val="ListBullet"/>
-      </w:pPr>
-      <w:r>
-        <w:t>Keine automatische Letztentscheidung.</w:t>
-      </w:r>
-    </w:p>
-    <w:p>
-      <w:pPr>
-        <w:pStyle w:val="ListBullet"/>
-      </w:pPr>
-      <w:r>
-        <w:t>Keine Absenkung unter die Würde- und Teilhabeebene.</w:t>
-      </w:r>
-    </w:p>
-    <w:p>
-      <w:pPr>
-        <w:pStyle w:val="ListBullet"/>
-      </w:pPr>
-      <w:r>
-        <w:t>Keine pauschale Bewertung von Personen nach Branchenzugehörigkeit.</w:t>
-      </w:r>
-    </w:p>
-    <w:p>
-      <w:pPr>
-        <w:pStyle w:val="ListBullet"/>
-      </w:pPr>
-      <w:r>
-        <w:t>Datensparsamkeit und Zweckbindung.</w:t>
-      </w:r>
-    </w:p>
-    <w:p>
-      <w:pPr>
-        <w:pStyle w:val="ListBullet"/>
-      </w:pPr>
-      <w:r>
-        <w:t>Recht auf Auskunft, Korrektur und Widerspruch.</w:t>
-      </w:r>
-    </w:p>
-    <w:p>
-      <w:pPr>
-        <w:pStyle w:val="ListBullet"/>
-      </w:pPr>
-      <w:r>
-        <w:t>Parlamentarische und gerichtliche Kontrolle.</w:t>
-      </w:r>
-    </w:p>
-    <w:p>
-      <w:pPr>
-        <w:pStyle w:val="Heading2"/>
-      </w:pPr>
-      <w:r>
-        <w:t>8. Politische Anschlussfähigkeit</w:t>
-      </w:r>
-    </w:p>
-    <w:p>
-      <w:r>
-        <w:t>Der Baustein ist politisch offen. Er kann konservativ als Anerkennung von Lebensleistung, sozialdemokratisch als soziale Sicherheit, liberal als Eigenverantwortung mit transparenten Anreizen, grün als Zukunftsinvestition, links als Schutz vor Altersarmut, kommunal als Teilhabeinstrument oder wirtschaftsnah als Resilienzfaktor interpretiert werden. Die Wirkungsökonomie gibt den Rahmen, nicht die parteipolitische Detailentscheidung vor.</w:t>
-      </w:r>
-    </w:p>
-    <w:p>
-      <w:pPr>
-        <w:pStyle w:val="Heading2"/>
-      </w:pPr>
-      <w:r>
-        <w:t>9. SDG-/SDG+-Bezug</w:t>
-      </w:r>
-    </w:p>
-    <w:p>
-      <w:r>
-        <w:t>SDG 16, SDG 17, SDG+ Demokratie, SDG+ Diskursfähigkeit</w:t>
-      </w:r>
-    </w:p>
-    <w:p>
-      <w:pPr>
-        <w:pStyle w:val="Heading2"/>
-      </w:pPr>
-      <w:r>
-        <w:t>10. Online-Umsetzung</w:t>
-      </w:r>
-    </w:p>
-    <w:p>
-      <w:r>
-        <w:t>Dieses Detailkonzept sollte online unter /wirkungsfelder/rente-soziale-sicherung/politische-umsetzung/ veröffentlicht werden. Die Seite benötigt Inhaltsverzeichnis, Kapitelanker, Dossier-Download, Kontext-Werkzeuge, Buchanker, SDG-/SDG+-Referenzblock und Druckfunktion.</w:t>
-      </w:r>
-    </w:p>
-    <w:p>
-      <w:r>
-        <w:br w:type="page"/>
-      </w:r>
-    </w:p>
-    <w:p>
-      <w:pPr>
-        <w:pStyle w:val="Heading1"/>
-      </w:pPr>
-      <w:r>
         <w:t>Quellen und Referenzen</w:t>
       </w:r>
     </w:p>
     <w:p>
       <w:r>
-        <w:t>Die folgenden Quellen dienen als öffentliche und interne Referenzpunkte. Externe Links sind als Informationsquellen angegeben; die wirkungsökonomische Einordnung erfolgt im Rahmen der Wirkungsökonomie.</w:t>
+        <w:t>Die folgenden Quellen dienen als öffentliche und methodische Referenzpunkte. Externe Links sind als Informationsquellen angegeben; die wirkungsökonomische Einordnung erfolgt im Rahmen der Wirkungsökonomie.</w:t>
       </w:r>
     </w:p>
     <w:p>
@@ -2980,13 +2845,13 @@
         </w:rPr>
         <w:t xml:space="preserve">BMAS Rentenversicherungsbericht 2025: </w:t>
       </w:r>
-      <w:hyperlink r:id="rId11">
+      <w:hyperlink ns2:id="rId11">
         <w:r>
           <w:rPr>
             <w:color w:val="2B7D5C"/>
             <w:u w:val="single"/>
           </w:rPr>
-          <w:t>https://www.bmas.de/DE/Service/Presse/Pressemitteilungen/2025/bundeskabinett-beschliesst-rentenversicherungsbericht-2025.html</w:t>
+          <w:t>https://www.bmas.de/SharedDocs/Downloads/DE/Rente/rentenversicherungsbericht-2025.html</w:t>
         </w:r>
       </w:hyperlink>
     </w:p>
@@ -3000,7 +2865,7 @@
         </w:rPr>
         <w:t xml:space="preserve">Destatis Babyboomer und Erwerbspersonen 2025: </w:t>
       </w:r>
-      <w:hyperlink r:id="rId12">
+      <w:hyperlink ns2:id="rId12">
         <w:r>
           <w:rPr>
             <w:color w:val="2B7D5C"/>
@@ -3020,7 +2885,7 @@
         </w:rPr>
         <w:t xml:space="preserve">Destatis Altenquotient 2025: </w:t>
       </w:r>
-      <w:hyperlink r:id="rId13">
+      <w:hyperlink ns2:id="rId13">
         <w:r>
           <w:rPr>
             <w:color w:val="2B7D5C"/>
@@ -3040,13 +2905,13 @@
         </w:rPr>
         <w:t xml:space="preserve">Deutsche Rentenversicherung in Zahlen 2025: </w:t>
       </w:r>
-      <w:hyperlink r:id="rId14">
+      <w:hyperlink ns2:id="rId14">
         <w:r>
           <w:rPr>
             <w:color w:val="2B7D5C"/>
             <w:u w:val="single"/>
           </w:rPr>
-          <w:t>https://www.deutsche-rentenversicherung.de/SharedDocs/Downloads/DE/Statistiken-und-Berichte/statistikpublikationen/rv_in_zahlen.pdf</w:t>
+          <w:t>https://www.deutsche-rentenversicherung.de/SharedDocs/Downloads/DE/Statistiken-und-Berichte/statistikpublikationen/rv_in_zahlen.html</w:t>
         </w:r>
       </w:hyperlink>
     </w:p>
@@ -3060,7 +2925,7 @@
         </w:rPr>
         <w:t xml:space="preserve">OECD Pensions at a Glance 2025: Germany: </w:t>
       </w:r>
-      <w:hyperlink r:id="rId15">
+      <w:hyperlink ns2:id="rId15">
         <w:r>
           <w:rPr>
             <w:color w:val="2B7D5C"/>
@@ -3071,8 +2936,8 @@
       </w:hyperlink>
     </w:p>
     <w:sectPr>
-      <w:headerReference w:type="default" r:id="rId9"/>
-      <w:footerReference w:type="default" r:id="rId10"/>
+      <w:headerReference w:type="default" ns2:id="rId9"/>
+      <w:footerReference w:type="default" ns2:id="rId10"/>
       <w:pgSz w:w="12240" w:h="15840"/>
       <w:pgMar w:top="964" w:right="1020" w:bottom="907" w:left="1020" w:header="397" w:footer="397" w:gutter="0"/>
       <w:cols w:space="720"/>

</xml_diff>